<commit_message>
doc: Adiciona documento de requisitos do projeto que contém a regra de negócio do sistema, e adiciona correções ao documento de requisitos funcionais
</commit_message>
<xml_diff>
--- a/doc/Requisitos-funcionais.docx
+++ b/doc/Requisitos-funcionais.docx
@@ -843,7 +843,33 @@
                     <w:rPr>
                       <w:rFonts w:ascii="Verdana" w:eastAsia="Verdana" w:hAnsi="Verdana" w:cs="Verdana"/>
                     </w:rPr>
-                    <w:t xml:space="preserve">login possui uma etiqueta que quando clicada redireciona o usuário para uma tela onde </w:t>
+                    <w:t xml:space="preserve">login possui uma etiqueta que quando clicada redireciona o usuário para uma </w:t>
+                  </w:r>
+                  <w:proofErr w:type="gramStart"/>
+                  <w:r>
+                    <w:rPr>
+                      <w:rFonts w:ascii="Verdana" w:eastAsia="Verdana" w:hAnsi="Verdana" w:cs="Verdana"/>
+                    </w:rPr>
+                    <w:t>tela</w:t>
+                  </w:r>
+                  <w:r>
+                    <w:rPr>
+                      <w:rFonts w:ascii="Verdana" w:eastAsia="Verdana" w:hAnsi="Verdana" w:cs="Verdana"/>
+                    </w:rPr>
+                    <w:t xml:space="preserve">, </w:t>
+                  </w:r>
+                  <w:r>
+                    <w:rPr>
+                      <w:rFonts w:ascii="Verdana" w:eastAsia="Verdana" w:hAnsi="Verdana" w:cs="Verdana"/>
+                    </w:rPr>
+                    <w:t xml:space="preserve"> onde</w:t>
+                  </w:r>
+                  <w:proofErr w:type="gramEnd"/>
+                  <w:r>
+                    <w:rPr>
+                      <w:rFonts w:ascii="Verdana" w:eastAsia="Verdana" w:hAnsi="Verdana" w:cs="Verdana"/>
+                    </w:rPr>
+                    <w:t xml:space="preserve"> </w:t>
                   </w:r>
                   <w:r>
                     <w:rPr>
@@ -855,7 +881,19 @@
                     <w:rPr>
                       <w:rFonts w:ascii="Verdana" w:eastAsia="Verdana" w:hAnsi="Verdana" w:cs="Verdana"/>
                     </w:rPr>
-                    <w:t xml:space="preserve">digita o E-mail dele </w:t>
+                    <w:t>digita o E-mail dele</w:t>
+                  </w:r>
+                  <w:r>
+                    <w:rPr>
+                      <w:rFonts w:ascii="Verdana" w:eastAsia="Verdana" w:hAnsi="Verdana" w:cs="Verdana"/>
+                    </w:rPr>
+                    <w:t>,</w:t>
+                  </w:r>
+                  <w:r>
+                    <w:rPr>
+                      <w:rFonts w:ascii="Verdana" w:eastAsia="Verdana" w:hAnsi="Verdana" w:cs="Verdana"/>
+                    </w:rPr>
+                    <w:t xml:space="preserve"> </w:t>
                   </w:r>
                   <w:r>
                     <w:rPr>
@@ -874,6 +912,58 @@
                       <w:rFonts w:ascii="Verdana" w:eastAsia="Verdana" w:hAnsi="Verdana" w:cs="Verdana"/>
                     </w:rPr>
                     <w:t>E-mail dele.</w:t>
+                  </w:r>
+                </w:p>
+                <w:p>
+                  <w:pPr>
+                    <w:framePr w:hSpace="141" w:wrap="around" w:hAnchor="margin" w:x="-289" w:y="548"/>
+                    <w:ind w:right="85"/>
+                    <w:jc w:val="both"/>
+                    <w:cnfStyle w:val="000000000000" w:firstRow="0" w:lastRow="0" w:firstColumn="0" w:lastColumn="0" w:oddVBand="0" w:evenVBand="0" w:oddHBand="0" w:evenHBand="0" w:firstRowFirstColumn="0" w:firstRowLastColumn="0" w:lastRowFirstColumn="0" w:lastRowLastColumn="0"/>
+                    <w:rPr>
+                      <w:rFonts w:ascii="Verdana" w:eastAsia="Verdana" w:hAnsi="Verdana" w:cs="Verdana"/>
+                    </w:rPr>
+                  </w:pPr>
+                </w:p>
+                <w:p>
+                  <w:pPr>
+                    <w:framePr w:hSpace="141" w:wrap="around" w:hAnchor="margin" w:x="-289" w:y="548"/>
+                    <w:ind w:right="85"/>
+                    <w:jc w:val="both"/>
+                    <w:cnfStyle w:val="000000000000" w:firstRow="0" w:lastRow="0" w:firstColumn="0" w:lastColumn="0" w:oddVBand="0" w:evenVBand="0" w:oddHBand="0" w:evenHBand="0" w:firstRowFirstColumn="0" w:firstRowLastColumn="0" w:lastRowFirstColumn="0" w:lastRowLastColumn="0"/>
+                    <w:rPr>
+                      <w:rFonts w:ascii="Verdana" w:eastAsia="Verdana" w:hAnsi="Verdana" w:cs="Verdana"/>
+                    </w:rPr>
+                  </w:pPr>
+                  <w:r>
+                    <w:rPr>
+                      <w:rFonts w:ascii="Verdana" w:eastAsia="Verdana" w:hAnsi="Verdana" w:cs="Verdana"/>
+                    </w:rPr>
+                    <w:t>O link enviado no e</w:t>
+                  </w:r>
+                  <w:r>
+                    <w:rPr>
+                      <w:rFonts w:ascii="Verdana" w:eastAsia="Verdana" w:hAnsi="Verdana" w:cs="Verdana"/>
+                    </w:rPr>
+                    <w:t>-</w:t>
+                  </w:r>
+                  <w:r>
+                    <w:rPr>
+                      <w:rFonts w:ascii="Verdana" w:eastAsia="Verdana" w:hAnsi="Verdana" w:cs="Verdana"/>
+                    </w:rPr>
+                    <w:t xml:space="preserve">mail para redefinição, o envia para uma página onde </w:t>
+                  </w:r>
+                  <w:r>
+                    <w:rPr>
+                      <w:rFonts w:ascii="Verdana" w:eastAsia="Verdana" w:hAnsi="Verdana" w:cs="Verdana"/>
+                    </w:rPr>
+                    <w:t xml:space="preserve">ele digita a senha nova duas vezes para redefinir, assim que </w:t>
+                  </w:r>
+                  <w:r>
+                    <w:rPr>
+                      <w:rFonts w:ascii="Verdana" w:eastAsia="Verdana" w:hAnsi="Verdana" w:cs="Verdana"/>
+                    </w:rPr>
+                    <w:t xml:space="preserve">o botão “Concluir” for pressionado, a senha será redefinida para a nova que o usuário digitou. </w:t>
                   </w:r>
                 </w:p>
                 <w:p>
@@ -1134,6 +1224,7 @@
                     <w:rPr>
                       <w:rFonts w:ascii="Verdana" w:eastAsia="Verdana" w:hAnsi="Verdana" w:cs="Verdana"/>
                     </w:rPr>
+                    <w:lastRenderedPageBreak/>
                     <w:t>-</w:t>
                   </w:r>
                   <w:r>
@@ -1246,19 +1337,8 @@
                 <w:p>
                   <w:pPr>
                     <w:framePr w:hSpace="141" w:wrap="around" w:hAnchor="margin" w:x="-289" w:y="548"/>
-                    <w:ind w:right="85"/>
-                    <w:jc w:val="both"/>
-                    <w:cnfStyle w:val="000000100000" w:firstRow="0" w:lastRow="0" w:firstColumn="0" w:lastColumn="0" w:oddVBand="0" w:evenVBand="0" w:oddHBand="1" w:evenHBand="0" w:firstRowFirstColumn="0" w:firstRowLastColumn="0" w:lastRowFirstColumn="0" w:lastRowLastColumn="0"/>
-                    <w:rPr>
-                      <w:rFonts w:ascii="Verdana" w:eastAsia="Verdana" w:hAnsi="Verdana" w:cs="Verdana"/>
-                    </w:rPr>
-                  </w:pPr>
-                </w:p>
-                <w:p>
-                  <w:pPr>
-                    <w:framePr w:hSpace="141" w:wrap="around" w:hAnchor="margin" w:x="-289" w:y="548"/>
                     <w:spacing w:line="241" w:lineRule="auto"/>
-                    <w:ind w:left="109" w:right="116"/>
+                    <w:ind w:right="116"/>
                     <w:jc w:val="both"/>
                     <w:cnfStyle w:val="000000100000" w:firstRow="0" w:lastRow="0" w:firstColumn="0" w:lastColumn="0" w:oddVBand="0" w:evenVBand="0" w:oddHBand="1" w:evenHBand="0" w:firstRowFirstColumn="0" w:firstRowLastColumn="0" w:lastRowFirstColumn="0" w:lastRowLastColumn="0"/>
                   </w:pPr>
@@ -1796,6 +1876,7 @@
                     <w:rPr>
                       <w:rFonts w:ascii="Verdana" w:hAnsi="Verdana"/>
                     </w:rPr>
+                    <w:lastRenderedPageBreak/>
                     <w:t>2.2</w:t>
                   </w:r>
                 </w:p>
@@ -2017,7 +2098,6 @@
                     <w:rPr>
                       <w:rFonts w:ascii="Verdana" w:hAnsi="Verdana"/>
                     </w:rPr>
-                    <w:lastRenderedPageBreak/>
                     <w:t>O psicopedagogo diferente do responsável pode adicionar quantos pacientes precisar</w:t>
                   </w:r>
                   <w:r>
@@ -2696,7 +2776,6 @@
                     <w:rPr>
                       <w:rFonts w:ascii="Verdana" w:eastAsia="Verdana" w:hAnsi="Verdana" w:cs="Verdana"/>
                     </w:rPr>
-                    <w:lastRenderedPageBreak/>
                     <w:t xml:space="preserve">Ao clicar no botão de editar a senha, o </w:t>
                   </w:r>
                   <w:proofErr w:type="gramStart"/>
@@ -3229,6 +3308,7 @@
                     <w:rPr>
                       <w:rFonts w:ascii="Verdana" w:eastAsia="Verdana" w:hAnsi="Verdana" w:cs="Verdana"/>
                     </w:rPr>
+                    <w:lastRenderedPageBreak/>
                     <w:t>Ao clicar no botão de Editar o perfil, o usuário será redirecionado a uma tela onde será possível editar as informações anteriores, e editar a senha.</w:t>
                   </w:r>
                 </w:p>
@@ -3277,7 +3357,6 @@
                     <w:rPr>
                       <w:rFonts w:ascii="Verdana" w:eastAsia="Verdana" w:hAnsi="Verdana" w:cs="Verdana"/>
                     </w:rPr>
-                    <w:lastRenderedPageBreak/>
                     <w:t xml:space="preserve">Ao clicar no botão de excluir a conta, aparecera um card onde pede com que o usuário digite a senha dele duas vezes para que a conta seja excluída. </w:t>
                   </w:r>
                 </w:p>
@@ -4224,6 +4303,7 @@
                       <w:b/>
                       <w:bCs/>
                     </w:rPr>
+                    <w:lastRenderedPageBreak/>
                     <w:t>descrição</w:t>
                   </w:r>
                   <w:r>
@@ -4332,7 +4412,6 @@
                       <w:b/>
                       <w:bCs/>
                     </w:rPr>
-                    <w:lastRenderedPageBreak/>
                     <w:t>Autismo e TDAH</w:t>
                   </w:r>
                   <w:r>
@@ -4782,7 +4861,14 @@
                     <w:rPr>
                       <w:rFonts w:ascii="Verdana" w:hAnsi="Verdana"/>
                     </w:rPr>
-                    <w:t>Será encaminhado diretamente para a tela de avaliação, que contém atividades das habilidades de:</w:t>
+                    <w:t xml:space="preserve">Será encaminhado diretamente para a tela de avaliação, que contém </w:t>
+                  </w:r>
+                  <w:r>
+                    <w:rPr>
+                      <w:rFonts w:ascii="Verdana" w:hAnsi="Verdana"/>
+                    </w:rPr>
+                    <w:lastRenderedPageBreak/>
+                    <w:t>atividades das habilidades de:</w:t>
                   </w:r>
                 </w:p>
                 <w:p>
@@ -4890,7 +4976,6 @@
                       <w:b/>
                       <w:bCs/>
                     </w:rPr>
-                    <w:lastRenderedPageBreak/>
                     <w:t>Auto-Cuidados</w:t>
                   </w:r>
                   <w:proofErr w:type="spellEnd"/>
@@ -5140,6 +5225,7 @@
                     <w:rPr>
                       <w:rFonts w:ascii="Verdana" w:hAnsi="Verdana"/>
                     </w:rPr>
+                    <w:lastRenderedPageBreak/>
                     <w:t>É possível enviar essa avaliação incompleta devido ser extensa. As respostas ficarão salvas.</w:t>
                   </w:r>
                 </w:p>
@@ -5299,7 +5385,6 @@
                     <w:rPr>
                       <w:rFonts w:ascii="Verdana" w:hAnsi="Verdana"/>
                     </w:rPr>
-                    <w:lastRenderedPageBreak/>
                     <w:t>ID</w:t>
                   </w:r>
                 </w:p>
@@ -5824,14 +5909,14 @@
                     <w:rPr>
                       <w:rFonts w:ascii="Verdana" w:eastAsia="Verdana" w:hAnsi="Verdana" w:cs="Verdana"/>
                     </w:rPr>
-                    <w:t xml:space="preserve">Cada atividade nova tem um peso em meses, cada vez que uma atividade for concluída, e ele desenvolver determinado comportamento, será contabilizado esses meses na área desse comportamento desenvolvido. Ou seja, caso ele tenha realizado uma </w:t>
+                    <w:t xml:space="preserve">Cada atividade nova tem um peso em meses, cada vez que uma atividade for </w:t>
                   </w:r>
                   <w:r>
                     <w:rPr>
                       <w:rFonts w:ascii="Verdana" w:eastAsia="Verdana" w:hAnsi="Verdana" w:cs="Verdana"/>
                     </w:rPr>
                     <w:lastRenderedPageBreak/>
-                    <w:t xml:space="preserve">atividade da área de socialização, e ter desenvolvido o comportamento esperado, o peso dessa atividade será contabilizado na área de socialização. </w:t>
+                    <w:t xml:space="preserve">concluída, e ele desenvolver determinado comportamento, será contabilizado esses meses na área desse comportamento desenvolvido. Ou seja, caso ele tenha realizado uma atividade da área de socialização, e ter desenvolvido o comportamento esperado, o peso dessa atividade será contabilizado na área de socialização. </w:t>
                   </w:r>
                   <w:proofErr w:type="spellStart"/>
                   <w:r>
@@ -6266,7 +6351,14 @@
                     <w:rPr>
                       <w:rFonts w:ascii="Verdana" w:eastAsia="Verdana" w:hAnsi="Verdana" w:cs="Verdana"/>
                     </w:rPr>
-                    <w:t>Cada uma dessas habilidades possui diferentes atividades cadastradas.</w:t>
+                    <w:t xml:space="preserve">Cada uma dessas habilidades possui </w:t>
+                  </w:r>
+                  <w:r>
+                    <w:rPr>
+                      <w:rFonts w:ascii="Verdana" w:eastAsia="Verdana" w:hAnsi="Verdana" w:cs="Verdana"/>
+                    </w:rPr>
+                    <w:lastRenderedPageBreak/>
+                    <w:t>diferentes atividades cadastradas.</w:t>
                   </w:r>
                 </w:p>
               </w:tc>
@@ -6293,6 +6385,7 @@
                     <w:rPr>
                       <w:rFonts w:ascii="Verdana" w:hAnsi="Verdana"/>
                     </w:rPr>
+                    <w:lastRenderedPageBreak/>
                     <w:t>7</w:t>
                   </w:r>
                   <w:r>
@@ -6361,14 +6454,7 @@
                     <w:rPr>
                       <w:rFonts w:ascii="Verdana" w:eastAsia="Verdana" w:hAnsi="Verdana" w:cs="Verdana"/>
                     </w:rPr>
-                    <w:t xml:space="preserve">No final da página do paciente, tem um botão que quando clicado, o psicopedagogo é redirecionado para o </w:t>
-                  </w:r>
-                  <w:r>
-                    <w:rPr>
-                      <w:rFonts w:ascii="Verdana" w:eastAsia="Verdana" w:hAnsi="Verdana" w:cs="Verdana"/>
-                    </w:rPr>
-                    <w:lastRenderedPageBreak/>
-                    <w:t>formulário de antes para continuar preenchendo, ou editá-lo.</w:t>
+                    <w:t>No final da página do paciente, tem um botão que quando clicado, o psicopedagogo é redirecionado para o formulário de antes para continuar preenchendo, ou editá-lo.</w:t>
                   </w:r>
                 </w:p>
               </w:tc>
@@ -7067,6 +7153,7 @@
                     <w:rPr>
                       <w:rFonts w:ascii="Verdana" w:hAnsi="Verdana"/>
                     </w:rPr>
+                    <w:lastRenderedPageBreak/>
                     <w:t>8</w:t>
                   </w:r>
                   <w:r>
@@ -7165,14 +7252,7 @@
                     <w:rPr>
                       <w:rFonts w:ascii="Verdana" w:eastAsia="Verdana" w:hAnsi="Verdana" w:cs="Verdana"/>
                     </w:rPr>
-                    <w:t xml:space="preserve">Essas Habilidades são medidas com idade para observar o déficit de </w:t>
-                  </w:r>
-                  <w:r>
-                    <w:rPr>
-                      <w:rFonts w:ascii="Verdana" w:eastAsia="Verdana" w:hAnsi="Verdana" w:cs="Verdana"/>
-                    </w:rPr>
-                    <w:lastRenderedPageBreak/>
-                    <w:t>aprendizagem do paciente em relação ao comportamento dela.</w:t>
+                    <w:t>Essas Habilidades são medidas com idade para observar o déficit de aprendizagem do paciente em relação ao comportamento dela.</w:t>
                   </w:r>
                 </w:p>
                 <w:p>
@@ -7385,6 +7465,105 @@
           <w:tcPr>
             <w:tcW w:w="9032" w:type="dxa"/>
           </w:tcPr>
+          <w:p>
+            <w:pPr>
+              <w:rPr>
+                <w:rFonts w:ascii="Verdana" w:hAnsi="Verdana"/>
+                <w:b/>
+                <w:bCs/>
+                <w:sz w:val="22"/>
+                <w:szCs w:val="22"/>
+              </w:rPr>
+            </w:pPr>
+          </w:p>
+          <w:p>
+            <w:pPr>
+              <w:rPr>
+                <w:rFonts w:ascii="Verdana" w:hAnsi="Verdana"/>
+                <w:b/>
+                <w:bCs/>
+                <w:sz w:val="22"/>
+                <w:szCs w:val="22"/>
+              </w:rPr>
+            </w:pPr>
+          </w:p>
+          <w:p>
+            <w:pPr>
+              <w:rPr>
+                <w:rFonts w:ascii="Verdana" w:hAnsi="Verdana"/>
+                <w:b/>
+                <w:bCs/>
+                <w:sz w:val="22"/>
+                <w:szCs w:val="22"/>
+              </w:rPr>
+            </w:pPr>
+          </w:p>
+          <w:p>
+            <w:pPr>
+              <w:rPr>
+                <w:rFonts w:ascii="Verdana" w:hAnsi="Verdana"/>
+                <w:b/>
+                <w:bCs/>
+                <w:sz w:val="22"/>
+                <w:szCs w:val="22"/>
+              </w:rPr>
+            </w:pPr>
+          </w:p>
+          <w:p>
+            <w:pPr>
+              <w:rPr>
+                <w:rFonts w:ascii="Verdana" w:hAnsi="Verdana"/>
+                <w:b/>
+                <w:bCs/>
+                <w:sz w:val="22"/>
+                <w:szCs w:val="22"/>
+              </w:rPr>
+            </w:pPr>
+          </w:p>
+          <w:p>
+            <w:pPr>
+              <w:rPr>
+                <w:rFonts w:ascii="Verdana" w:hAnsi="Verdana"/>
+                <w:b/>
+                <w:bCs/>
+                <w:sz w:val="22"/>
+                <w:szCs w:val="22"/>
+              </w:rPr>
+            </w:pPr>
+          </w:p>
+          <w:p>
+            <w:pPr>
+              <w:rPr>
+                <w:rFonts w:ascii="Verdana" w:hAnsi="Verdana"/>
+                <w:b/>
+                <w:bCs/>
+                <w:sz w:val="22"/>
+                <w:szCs w:val="22"/>
+              </w:rPr>
+            </w:pPr>
+          </w:p>
+          <w:p>
+            <w:pPr>
+              <w:rPr>
+                <w:rFonts w:ascii="Verdana" w:hAnsi="Verdana"/>
+                <w:b/>
+                <w:bCs/>
+                <w:sz w:val="22"/>
+                <w:szCs w:val="22"/>
+              </w:rPr>
+            </w:pPr>
+          </w:p>
+          <w:p>
+            <w:pPr>
+              <w:rPr>
+                <w:rFonts w:ascii="Verdana" w:hAnsi="Verdana"/>
+                <w:b/>
+                <w:bCs/>
+                <w:sz w:val="22"/>
+                <w:szCs w:val="22"/>
+              </w:rPr>
+            </w:pPr>
+          </w:p>
           <w:p>
             <w:pPr>
               <w:rPr>
@@ -8002,7 +8181,14 @@
                     <w:rPr>
                       <w:rFonts w:ascii="Verdana" w:eastAsia="Verdana" w:hAnsi="Verdana" w:cs="Verdana"/>
                     </w:rPr>
-                    <w:t>Logo após responder as perguntas, você pode salvar a resposta, e ela é salva no histórico de tentativas junto com a data de aplicação.</w:t>
+                    <w:t xml:space="preserve">Logo após responder as perguntas, você pode salvar a resposta, e ela é salva no </w:t>
+                  </w:r>
+                  <w:r>
+                    <w:rPr>
+                      <w:rFonts w:ascii="Verdana" w:eastAsia="Verdana" w:hAnsi="Verdana" w:cs="Verdana"/>
+                    </w:rPr>
+                    <w:lastRenderedPageBreak/>
+                    <w:t>histórico de tentativas junto com a data de aplicação.</w:t>
                   </w:r>
                 </w:p>
                 <w:p>
@@ -8042,13 +8228,8 @@
                     <w:rPr>
                       <w:rFonts w:ascii="Verdana" w:hAnsi="Verdana"/>
                     </w:rPr>
-                    <w:t>9</w:t>
-                  </w:r>
-                  <w:r>
-                    <w:rPr>
-                      <w:rFonts w:ascii="Verdana" w:hAnsi="Verdana"/>
-                    </w:rPr>
-                    <w:t>.3</w:t>
+                    <w:lastRenderedPageBreak/>
+                    <w:t>9.3</w:t>
                   </w:r>
                 </w:p>
               </w:tc>
@@ -8070,11 +8251,13 @@
                   </w:pPr>
                   <w:r>
                     <w:rPr>
-                      <w:rFonts w:ascii="Verdana" w:eastAsia="Verdana" w:hAnsi="Verdana" w:cs="Verdana"/>
-                      <w:b/>
-                      <w:bCs/>
-                    </w:rPr>
-                    <w:t>Declarar comportamento</w:t>
+                      <w:rFonts w:ascii="Verdana" w:hAnsi="Verdana"/>
+                      <w:b/>
+                      <w:bCs/>
+                      <w:sz w:val="22"/>
+                      <w:szCs w:val="22"/>
+                    </w:rPr>
+                    <w:t>Visualizar detalhes de alguma tentativa</w:t>
                   </w:r>
                 </w:p>
               </w:tc>
@@ -8086,7 +8269,7 @@
                 <w:p>
                   <w:pPr>
                     <w:framePr w:hSpace="141" w:wrap="around" w:hAnchor="margin" w:x="-289" w:y="548"/>
-                    <w:spacing w:line="241" w:lineRule="auto"/>
+                    <w:spacing w:after="1"/>
                     <w:ind w:right="84"/>
                     <w:jc w:val="both"/>
                     <w:cnfStyle w:val="000000100000" w:firstRow="0" w:lastRow="0" w:firstColumn="0" w:lastColumn="0" w:oddVBand="0" w:evenVBand="0" w:oddHBand="1" w:evenHBand="0" w:firstRowFirstColumn="0" w:firstRowLastColumn="0" w:lastRowFirstColumn="0" w:lastRowLastColumn="0"/>
@@ -8094,11 +8277,28 @@
                       <w:rFonts w:ascii="Verdana" w:eastAsia="Verdana" w:hAnsi="Verdana" w:cs="Verdana"/>
                     </w:rPr>
                   </w:pPr>
-                </w:p>
-                <w:p>
-                  <w:pPr>
-                    <w:framePr w:hSpace="141" w:wrap="around" w:hAnchor="margin" w:x="-289" w:y="548"/>
-                    <w:spacing w:line="241" w:lineRule="auto"/>
+                  <w:r>
+                    <w:rPr>
+                      <w:rFonts w:ascii="Verdana" w:eastAsia="Verdana" w:hAnsi="Verdana" w:cs="Verdana"/>
+                    </w:rPr>
+                    <w:t>Na página do histórico de tentativas, é possível ver detalhes d</w:t>
+                  </w:r>
+                  <w:r>
+                    <w:rPr>
+                      <w:rFonts w:ascii="Verdana" w:eastAsia="Verdana" w:hAnsi="Verdana" w:cs="Verdana"/>
+                    </w:rPr>
+                    <w:t>a tentativa realizada, ao clicar nesse botão um card abre com as seguintes informações:</w:t>
+                  </w:r>
+                </w:p>
+                <w:p>
+                  <w:pPr>
+                    <w:pStyle w:val="PargrafodaLista"/>
+                    <w:framePr w:hSpace="141" w:wrap="around" w:hAnchor="margin" w:x="-289" w:y="548"/>
+                    <w:numPr>
+                      <w:ilvl w:val="0"/>
+                      <w:numId w:val="35"/>
+                    </w:numPr>
+                    <w:spacing w:after="1"/>
                     <w:ind w:right="84"/>
                     <w:jc w:val="both"/>
                     <w:cnfStyle w:val="000000100000" w:firstRow="0" w:lastRow="0" w:firstColumn="0" w:lastColumn="0" w:oddVBand="0" w:evenVBand="0" w:oddHBand="1" w:evenHBand="0" w:firstRowFirstColumn="0" w:firstRowLastColumn="0" w:lastRowFirstColumn="0" w:lastRowLastColumn="0"/>
@@ -8110,13 +8310,20 @@
                     <w:rPr>
                       <w:rFonts w:ascii="Verdana" w:eastAsia="Verdana" w:hAnsi="Verdana" w:cs="Verdana"/>
                     </w:rPr>
-                    <w:t>O botão de declarar comportamento, só fica disponível após o paciente ter realizado duas tentativas da mesma atividade, e ter realizado independentemente.</w:t>
-                  </w:r>
-                </w:p>
-                <w:p>
-                  <w:pPr>
-                    <w:framePr w:hSpace="141" w:wrap="around" w:hAnchor="margin" w:x="-289" w:y="548"/>
-                    <w:spacing w:line="241" w:lineRule="auto"/>
+                    <w:t>Informação de como a atividade foi aplicada</w:t>
+                  </w:r>
+                  <w:r>
+                    <w:rPr>
+                      <w:rFonts w:ascii="Verdana" w:eastAsia="Verdana" w:hAnsi="Verdana" w:cs="Verdana"/>
+                    </w:rPr>
+                    <w:t>.</w:t>
+                  </w:r>
+                </w:p>
+                <w:p>
+                  <w:pPr>
+                    <w:pStyle w:val="PargrafodaLista"/>
+                    <w:framePr w:hSpace="141" w:wrap="around" w:hAnchor="margin" w:x="-289" w:y="548"/>
+                    <w:spacing w:after="1"/>
                     <w:ind w:right="84"/>
                     <w:jc w:val="both"/>
                     <w:cnfStyle w:val="000000100000" w:firstRow="0" w:lastRow="0" w:firstColumn="0" w:lastColumn="0" w:oddVBand="0" w:evenVBand="0" w:oddHBand="1" w:evenHBand="0" w:firstRowFirstColumn="0" w:firstRowLastColumn="0" w:lastRowFirstColumn="0" w:lastRowLastColumn="0"/>
@@ -8127,8 +8334,13 @@
                 </w:p>
                 <w:p>
                   <w:pPr>
-                    <w:framePr w:hSpace="141" w:wrap="around" w:hAnchor="margin" w:x="-289" w:y="548"/>
-                    <w:spacing w:line="241" w:lineRule="auto"/>
+                    <w:pStyle w:val="PargrafodaLista"/>
+                    <w:framePr w:hSpace="141" w:wrap="around" w:hAnchor="margin" w:x="-289" w:y="548"/>
+                    <w:numPr>
+                      <w:ilvl w:val="0"/>
+                      <w:numId w:val="35"/>
+                    </w:numPr>
+                    <w:spacing w:after="1"/>
                     <w:ind w:right="84"/>
                     <w:jc w:val="both"/>
                     <w:cnfStyle w:val="000000100000" w:firstRow="0" w:lastRow="0" w:firstColumn="0" w:lastColumn="0" w:oddVBand="0" w:evenVBand="0" w:oddHBand="1" w:evenHBand="0" w:firstRowFirstColumn="0" w:firstRowLastColumn="0" w:lastRowFirstColumn="0" w:lastRowLastColumn="0"/>
@@ -8140,13 +8352,91 @@
                     <w:rPr>
                       <w:rFonts w:ascii="Verdana" w:eastAsia="Verdana" w:hAnsi="Verdana" w:cs="Verdana"/>
                     </w:rPr>
-                    <w:t>Caso contrário, esse botão não aparece.</w:t>
-                  </w:r>
-                </w:p>
-                <w:p>
-                  <w:pPr>
-                    <w:framePr w:hSpace="141" w:wrap="around" w:hAnchor="margin" w:x="-289" w:y="548"/>
-                    <w:spacing w:line="241" w:lineRule="auto"/>
+                    <w:t>Se obteve êxito na tentativa de aplicação.</w:t>
+                  </w:r>
+                </w:p>
+                <w:p>
+                  <w:pPr>
+                    <w:framePr w:hSpace="141" w:wrap="around" w:hAnchor="margin" w:x="-289" w:y="548"/>
+                    <w:spacing w:after="1"/>
+                    <w:ind w:right="84"/>
+                    <w:jc w:val="both"/>
+                    <w:cnfStyle w:val="000000100000" w:firstRow="0" w:lastRow="0" w:firstColumn="0" w:lastColumn="0" w:oddVBand="0" w:evenVBand="0" w:oddHBand="1" w:evenHBand="0" w:firstRowFirstColumn="0" w:firstRowLastColumn="0" w:lastRowFirstColumn="0" w:lastRowLastColumn="0"/>
+                    <w:rPr>
+                      <w:rFonts w:ascii="Verdana" w:eastAsia="Verdana" w:hAnsi="Verdana" w:cs="Verdana"/>
+                    </w:rPr>
+                  </w:pPr>
+                </w:p>
+                <w:p>
+                  <w:pPr>
+                    <w:pStyle w:val="PargrafodaLista"/>
+                    <w:framePr w:hSpace="141" w:wrap="around" w:hAnchor="margin" w:x="-289" w:y="548"/>
+                    <w:numPr>
+                      <w:ilvl w:val="0"/>
+                      <w:numId w:val="35"/>
+                    </w:numPr>
+                    <w:spacing w:after="1"/>
+                    <w:ind w:right="84"/>
+                    <w:jc w:val="both"/>
+                    <w:cnfStyle w:val="000000100000" w:firstRow="0" w:lastRow="0" w:firstColumn="0" w:lastColumn="0" w:oddVBand="0" w:evenVBand="0" w:oddHBand="1" w:evenHBand="0" w:firstRowFirstColumn="0" w:firstRowLastColumn="0" w:lastRowFirstColumn="0" w:lastRowLastColumn="0"/>
+                    <w:rPr>
+                      <w:rFonts w:ascii="Verdana" w:eastAsia="Verdana" w:hAnsi="Verdana" w:cs="Verdana"/>
+                    </w:rPr>
+                  </w:pPr>
+                  <w:r>
+                    <w:rPr>
+                      <w:rFonts w:ascii="Verdana" w:eastAsia="Verdana" w:hAnsi="Verdana" w:cs="Verdana"/>
+                    </w:rPr>
+                    <w:t>E observações escritas pelo psicopedagogo.</w:t>
+                  </w:r>
+                </w:p>
+                <w:p>
+                  <w:pPr>
+                    <w:pStyle w:val="PargrafodaLista"/>
+                    <w:cnfStyle w:val="000000100000" w:firstRow="0" w:lastRow="0" w:firstColumn="0" w:lastColumn="0" w:oddVBand="0" w:evenVBand="0" w:oddHBand="1" w:evenHBand="0" w:firstRowFirstColumn="0" w:firstRowLastColumn="0" w:lastRowFirstColumn="0" w:lastRowLastColumn="0"/>
+                    <w:rPr>
+                      <w:rFonts w:ascii="Verdana" w:eastAsia="Verdana" w:hAnsi="Verdana" w:cs="Verdana"/>
+                    </w:rPr>
+                  </w:pPr>
+                </w:p>
+                <w:p>
+                  <w:pPr>
+                    <w:framePr w:hSpace="141" w:wrap="around" w:hAnchor="margin" w:x="-289" w:y="548"/>
+                    <w:spacing w:after="1"/>
+                    <w:ind w:right="84"/>
+                    <w:jc w:val="both"/>
+                    <w:cnfStyle w:val="000000100000" w:firstRow="0" w:lastRow="0" w:firstColumn="0" w:lastColumn="0" w:oddVBand="0" w:evenVBand="0" w:oddHBand="1" w:evenHBand="0" w:firstRowFirstColumn="0" w:firstRowLastColumn="0" w:lastRowFirstColumn="0" w:lastRowLastColumn="0"/>
+                    <w:rPr>
+                      <w:rFonts w:ascii="Verdana" w:eastAsia="Verdana" w:hAnsi="Verdana" w:cs="Verdana"/>
+                      <w:b/>
+                      <w:bCs/>
+                    </w:rPr>
+                  </w:pPr>
+                  <w:r>
+                    <w:rPr>
+                      <w:rFonts w:ascii="Verdana" w:eastAsia="Verdana" w:hAnsi="Verdana" w:cs="Verdana"/>
+                    </w:rPr>
+                    <w:t xml:space="preserve">É possível que o psicopedagogo não tenha escrito nada nesse campo, caso aconteça, </w:t>
+                  </w:r>
+                  <w:r>
+                    <w:rPr>
+                      <w:rFonts w:ascii="Verdana" w:eastAsia="Verdana" w:hAnsi="Verdana" w:cs="Verdana"/>
+                    </w:rPr>
+                    <w:t xml:space="preserve">no lugar onde haveria texto, deve ter a frase </w:t>
+                  </w:r>
+                  <w:r>
+                    <w:rPr>
+                      <w:rFonts w:ascii="Verdana" w:eastAsia="Verdana" w:hAnsi="Verdana" w:cs="Verdana"/>
+                      <w:b/>
+                      <w:bCs/>
+                    </w:rPr>
+                    <w:t>“Nenhuma observação”.</w:t>
+                  </w:r>
+                </w:p>
+                <w:p>
+                  <w:pPr>
+                    <w:framePr w:hSpace="141" w:wrap="around" w:hAnchor="margin" w:x="-289" w:y="548"/>
+                    <w:spacing w:after="1"/>
                     <w:ind w:right="84"/>
                     <w:jc w:val="both"/>
                     <w:cnfStyle w:val="000000100000" w:firstRow="0" w:lastRow="0" w:firstColumn="0" w:lastColumn="0" w:oddVBand="0" w:evenVBand="0" w:oddHBand="1" w:evenHBand="0" w:firstRowFirstColumn="0" w:firstRowLastColumn="0" w:lastRowFirstColumn="0" w:lastRowLastColumn="0"/>
@@ -8159,6 +8449,150 @@
             </w:tr>
             <w:tr>
               <w:trPr>
+                <w:trHeight w:val="1498"/>
+              </w:trPr>
+              <w:tc>
+                <w:tcPr>
+                  <w:cnfStyle w:val="001000000000" w:firstRow="0" w:lastRow="0" w:firstColumn="1" w:lastColumn="0" w:oddVBand="0" w:evenVBand="0" w:oddHBand="0" w:evenHBand="0" w:firstRowFirstColumn="0" w:firstRowLastColumn="0" w:lastRowFirstColumn="0" w:lastRowLastColumn="0"/>
+                  <w:tcW w:w="1512" w:type="dxa"/>
+                  <w:vAlign w:val="center"/>
+                </w:tcPr>
+                <w:p>
+                  <w:pPr>
+                    <w:framePr w:hSpace="141" w:wrap="around" w:hAnchor="margin" w:x="-289" w:y="548"/>
+                    <w:jc w:val="center"/>
+                    <w:rPr>
+                      <w:rFonts w:ascii="Verdana" w:hAnsi="Verdana"/>
+                    </w:rPr>
+                  </w:pPr>
+                  <w:r>
+                    <w:rPr>
+                      <w:rFonts w:ascii="Verdana" w:hAnsi="Verdana"/>
+                    </w:rPr>
+                    <w:t>9</w:t>
+                  </w:r>
+                  <w:r>
+                    <w:rPr>
+                      <w:rFonts w:ascii="Verdana" w:hAnsi="Verdana"/>
+                    </w:rPr>
+                    <w:t>.</w:t>
+                  </w:r>
+                  <w:r>
+                    <w:rPr>
+                      <w:rFonts w:ascii="Verdana" w:hAnsi="Verdana"/>
+                    </w:rPr>
+                    <w:t>4</w:t>
+                  </w:r>
+                </w:p>
+              </w:tc>
+              <w:tc>
+                <w:tcPr>
+                  <w:tcW w:w="3573" w:type="dxa"/>
+                  <w:vAlign w:val="center"/>
+                </w:tcPr>
+                <w:p>
+                  <w:pPr>
+                    <w:framePr w:hSpace="141" w:wrap="around" w:hAnchor="margin" w:x="-289" w:y="548"/>
+                    <w:jc w:val="center"/>
+                    <w:cnfStyle w:val="000000000000" w:firstRow="0" w:lastRow="0" w:firstColumn="0" w:lastColumn="0" w:oddVBand="0" w:evenVBand="0" w:oddHBand="0" w:evenHBand="0" w:firstRowFirstColumn="0" w:firstRowLastColumn="0" w:lastRowFirstColumn="0" w:lastRowLastColumn="0"/>
+                    <w:rPr>
+                      <w:rFonts w:ascii="Verdana" w:eastAsia="Verdana" w:hAnsi="Verdana" w:cs="Verdana"/>
+                      <w:b/>
+                      <w:bCs/>
+                    </w:rPr>
+                  </w:pPr>
+                  <w:r>
+                    <w:rPr>
+                      <w:rFonts w:ascii="Verdana" w:eastAsia="Verdana" w:hAnsi="Verdana" w:cs="Verdana"/>
+                      <w:b/>
+                      <w:bCs/>
+                    </w:rPr>
+                    <w:t>Declarar comportamento</w:t>
+                  </w:r>
+                </w:p>
+              </w:tc>
+              <w:tc>
+                <w:tcPr>
+                  <w:tcW w:w="3721" w:type="dxa"/>
+                  <w:vAlign w:val="center"/>
+                </w:tcPr>
+                <w:p>
+                  <w:pPr>
+                    <w:framePr w:hSpace="141" w:wrap="around" w:hAnchor="margin" w:x="-289" w:y="548"/>
+                    <w:spacing w:line="241" w:lineRule="auto"/>
+                    <w:ind w:right="84"/>
+                    <w:jc w:val="both"/>
+                    <w:cnfStyle w:val="000000000000" w:firstRow="0" w:lastRow="0" w:firstColumn="0" w:lastColumn="0" w:oddVBand="0" w:evenVBand="0" w:oddHBand="0" w:evenHBand="0" w:firstRowFirstColumn="0" w:firstRowLastColumn="0" w:lastRowFirstColumn="0" w:lastRowLastColumn="0"/>
+                    <w:rPr>
+                      <w:rFonts w:ascii="Verdana" w:eastAsia="Verdana" w:hAnsi="Verdana" w:cs="Verdana"/>
+                    </w:rPr>
+                  </w:pPr>
+                </w:p>
+                <w:p>
+                  <w:pPr>
+                    <w:framePr w:hSpace="141" w:wrap="around" w:hAnchor="margin" w:x="-289" w:y="548"/>
+                    <w:spacing w:line="241" w:lineRule="auto"/>
+                    <w:ind w:right="84"/>
+                    <w:jc w:val="both"/>
+                    <w:cnfStyle w:val="000000000000" w:firstRow="0" w:lastRow="0" w:firstColumn="0" w:lastColumn="0" w:oddVBand="0" w:evenVBand="0" w:oddHBand="0" w:evenHBand="0" w:firstRowFirstColumn="0" w:firstRowLastColumn="0" w:lastRowFirstColumn="0" w:lastRowLastColumn="0"/>
+                    <w:rPr>
+                      <w:rFonts w:ascii="Verdana" w:eastAsia="Verdana" w:hAnsi="Verdana" w:cs="Verdana"/>
+                    </w:rPr>
+                  </w:pPr>
+                  <w:r>
+                    <w:rPr>
+                      <w:rFonts w:ascii="Verdana" w:eastAsia="Verdana" w:hAnsi="Verdana" w:cs="Verdana"/>
+                    </w:rPr>
+                    <w:t>O botão de declarar comportamento, só fica disponível após o paciente ter realizado duas tentativas da mesma atividade, e ter realizado independentemente.</w:t>
+                  </w:r>
+                </w:p>
+                <w:p>
+                  <w:pPr>
+                    <w:framePr w:hSpace="141" w:wrap="around" w:hAnchor="margin" w:x="-289" w:y="548"/>
+                    <w:spacing w:line="241" w:lineRule="auto"/>
+                    <w:ind w:right="84"/>
+                    <w:jc w:val="both"/>
+                    <w:cnfStyle w:val="000000000000" w:firstRow="0" w:lastRow="0" w:firstColumn="0" w:lastColumn="0" w:oddVBand="0" w:evenVBand="0" w:oddHBand="0" w:evenHBand="0" w:firstRowFirstColumn="0" w:firstRowLastColumn="0" w:lastRowFirstColumn="0" w:lastRowLastColumn="0"/>
+                    <w:rPr>
+                      <w:rFonts w:ascii="Verdana" w:eastAsia="Verdana" w:hAnsi="Verdana" w:cs="Verdana"/>
+                    </w:rPr>
+                  </w:pPr>
+                </w:p>
+                <w:p>
+                  <w:pPr>
+                    <w:framePr w:hSpace="141" w:wrap="around" w:hAnchor="margin" w:x="-289" w:y="548"/>
+                    <w:spacing w:line="241" w:lineRule="auto"/>
+                    <w:ind w:right="84"/>
+                    <w:jc w:val="both"/>
+                    <w:cnfStyle w:val="000000000000" w:firstRow="0" w:lastRow="0" w:firstColumn="0" w:lastColumn="0" w:oddVBand="0" w:evenVBand="0" w:oddHBand="0" w:evenHBand="0" w:firstRowFirstColumn="0" w:firstRowLastColumn="0" w:lastRowFirstColumn="0" w:lastRowLastColumn="0"/>
+                    <w:rPr>
+                      <w:rFonts w:ascii="Verdana" w:eastAsia="Verdana" w:hAnsi="Verdana" w:cs="Verdana"/>
+                    </w:rPr>
+                  </w:pPr>
+                  <w:r>
+                    <w:rPr>
+                      <w:rFonts w:ascii="Verdana" w:eastAsia="Verdana" w:hAnsi="Verdana" w:cs="Verdana"/>
+                    </w:rPr>
+                    <w:t>Caso contrário, esse botão não aparece.</w:t>
+                  </w:r>
+                </w:p>
+                <w:p>
+                  <w:pPr>
+                    <w:framePr w:hSpace="141" w:wrap="around" w:hAnchor="margin" w:x="-289" w:y="548"/>
+                    <w:spacing w:line="241" w:lineRule="auto"/>
+                    <w:ind w:right="84"/>
+                    <w:jc w:val="both"/>
+                    <w:cnfStyle w:val="000000000000" w:firstRow="0" w:lastRow="0" w:firstColumn="0" w:lastColumn="0" w:oddVBand="0" w:evenVBand="0" w:oddHBand="0" w:evenHBand="0" w:firstRowFirstColumn="0" w:firstRowLastColumn="0" w:lastRowFirstColumn="0" w:lastRowLastColumn="0"/>
+                    <w:rPr>
+                      <w:rFonts w:ascii="Verdana" w:eastAsia="Verdana" w:hAnsi="Verdana" w:cs="Verdana"/>
+                    </w:rPr>
+                  </w:pPr>
+                </w:p>
+              </w:tc>
+            </w:tr>
+            <w:tr>
+              <w:trPr>
+                <w:cnfStyle w:val="000000100000" w:firstRow="0" w:lastRow="0" w:firstColumn="0" w:lastColumn="0" w:oddVBand="0" w:evenVBand="0" w:oddHBand="1" w:evenHBand="0" w:firstRowFirstColumn="0" w:firstRowLastColumn="0" w:lastRowFirstColumn="0" w:lastRowLastColumn="0"/>
                 <w:trHeight w:val="1689"/>
               </w:trPr>
               <w:tc>
@@ -8186,7 +8620,13 @@
                     <w:rPr>
                       <w:rFonts w:ascii="Verdana" w:hAnsi="Verdana"/>
                     </w:rPr>
-                    <w:t>.4</w:t>
+                    <w:t>.</w:t>
+                  </w:r>
+                  <w:r>
+                    <w:rPr>
+                      <w:rFonts w:ascii="Verdana" w:hAnsi="Verdana"/>
+                    </w:rPr>
+                    <w:t>5</w:t>
                   </w:r>
                 </w:p>
               </w:tc>
@@ -8199,7 +8639,7 @@
                   <w:pPr>
                     <w:framePr w:hSpace="141" w:wrap="around" w:hAnchor="margin" w:x="-289" w:y="548"/>
                     <w:jc w:val="center"/>
-                    <w:cnfStyle w:val="000000000000" w:firstRow="0" w:lastRow="0" w:firstColumn="0" w:lastColumn="0" w:oddVBand="0" w:evenVBand="0" w:oddHBand="0" w:evenHBand="0" w:firstRowFirstColumn="0" w:firstRowLastColumn="0" w:lastRowFirstColumn="0" w:lastRowLastColumn="0"/>
+                    <w:cnfStyle w:val="000000100000" w:firstRow="0" w:lastRow="0" w:firstColumn="0" w:lastColumn="0" w:oddVBand="0" w:evenVBand="0" w:oddHBand="1" w:evenHBand="0" w:firstRowFirstColumn="0" w:firstRowLastColumn="0" w:lastRowFirstColumn="0" w:lastRowLastColumn="0"/>
                     <w:rPr>
                       <w:rFonts w:ascii="Verdana" w:eastAsia="Verdana" w:hAnsi="Verdana" w:cs="Verdana"/>
                       <w:b/>
@@ -8227,7 +8667,7 @@
                     <w:spacing w:line="241" w:lineRule="auto"/>
                     <w:ind w:right="84"/>
                     <w:jc w:val="both"/>
-                    <w:cnfStyle w:val="000000000000" w:firstRow="0" w:lastRow="0" w:firstColumn="0" w:lastColumn="0" w:oddVBand="0" w:evenVBand="0" w:oddHBand="0" w:evenHBand="0" w:firstRowFirstColumn="0" w:firstRowLastColumn="0" w:lastRowFirstColumn="0" w:lastRowLastColumn="0"/>
+                    <w:cnfStyle w:val="000000100000" w:firstRow="0" w:lastRow="0" w:firstColumn="0" w:lastColumn="0" w:oddVBand="0" w:evenVBand="0" w:oddHBand="1" w:evenHBand="0" w:firstRowFirstColumn="0" w:firstRowLastColumn="0" w:lastRowFirstColumn="0" w:lastRowLastColumn="0"/>
                     <w:rPr>
                       <w:rFonts w:ascii="Verdana" w:eastAsia="Verdana" w:hAnsi="Verdana" w:cs="Verdana"/>
                     </w:rPr>
@@ -8239,7 +8679,7 @@
                     <w:spacing w:line="241" w:lineRule="auto"/>
                     <w:ind w:right="84"/>
                     <w:jc w:val="both"/>
-                    <w:cnfStyle w:val="000000000000" w:firstRow="0" w:lastRow="0" w:firstColumn="0" w:lastColumn="0" w:oddVBand="0" w:evenVBand="0" w:oddHBand="0" w:evenHBand="0" w:firstRowFirstColumn="0" w:firstRowLastColumn="0" w:lastRowFirstColumn="0" w:lastRowLastColumn="0"/>
+                    <w:cnfStyle w:val="000000100000" w:firstRow="0" w:lastRow="0" w:firstColumn="0" w:lastColumn="0" w:oddVBand="0" w:evenVBand="0" w:oddHBand="1" w:evenHBand="0" w:firstRowFirstColumn="0" w:firstRowLastColumn="0" w:lastRowFirstColumn="0" w:lastRowLastColumn="0"/>
                     <w:rPr>
                       <w:rFonts w:ascii="Verdana" w:eastAsia="Verdana" w:hAnsi="Verdana" w:cs="Verdana"/>
                     </w:rPr>
@@ -8257,7 +8697,7 @@
                     <w:spacing w:line="241" w:lineRule="auto"/>
                     <w:ind w:right="84"/>
                     <w:jc w:val="both"/>
-                    <w:cnfStyle w:val="000000000000" w:firstRow="0" w:lastRow="0" w:firstColumn="0" w:lastColumn="0" w:oddVBand="0" w:evenVBand="0" w:oddHBand="0" w:evenHBand="0" w:firstRowFirstColumn="0" w:firstRowLastColumn="0" w:lastRowFirstColumn="0" w:lastRowLastColumn="0"/>
+                    <w:cnfStyle w:val="000000100000" w:firstRow="0" w:lastRow="0" w:firstColumn="0" w:lastColumn="0" w:oddVBand="0" w:evenVBand="0" w:oddHBand="1" w:evenHBand="0" w:firstRowFirstColumn="0" w:firstRowLastColumn="0" w:lastRowFirstColumn="0" w:lastRowLastColumn="0"/>
                     <w:rPr>
                       <w:rFonts w:ascii="Verdana" w:eastAsia="Verdana" w:hAnsi="Verdana" w:cs="Verdana"/>
                     </w:rPr>
@@ -8269,7 +8709,7 @@
                     <w:spacing w:line="241" w:lineRule="auto"/>
                     <w:ind w:right="84"/>
                     <w:jc w:val="both"/>
-                    <w:cnfStyle w:val="000000000000" w:firstRow="0" w:lastRow="0" w:firstColumn="0" w:lastColumn="0" w:oddVBand="0" w:evenVBand="0" w:oddHBand="0" w:evenHBand="0" w:firstRowFirstColumn="0" w:firstRowLastColumn="0" w:lastRowFirstColumn="0" w:lastRowLastColumn="0"/>
+                    <w:cnfStyle w:val="000000100000" w:firstRow="0" w:lastRow="0" w:firstColumn="0" w:lastColumn="0" w:oddVBand="0" w:evenVBand="0" w:oddHBand="1" w:evenHBand="0" w:firstRowFirstColumn="0" w:firstRowLastColumn="0" w:lastRowFirstColumn="0" w:lastRowLastColumn="0"/>
                     <w:rPr>
                       <w:rFonts w:ascii="Verdana" w:eastAsia="Verdana" w:hAnsi="Verdana" w:cs="Verdana"/>
                     </w:rPr>
@@ -8287,7 +8727,7 @@
                     <w:spacing w:line="241" w:lineRule="auto"/>
                     <w:ind w:right="84"/>
                     <w:jc w:val="both"/>
-                    <w:cnfStyle w:val="000000000000" w:firstRow="0" w:lastRow="0" w:firstColumn="0" w:lastColumn="0" w:oddVBand="0" w:evenVBand="0" w:oddHBand="0" w:evenHBand="0" w:firstRowFirstColumn="0" w:firstRowLastColumn="0" w:lastRowFirstColumn="0" w:lastRowLastColumn="0"/>
+                    <w:cnfStyle w:val="000000100000" w:firstRow="0" w:lastRow="0" w:firstColumn="0" w:lastColumn="0" w:oddVBand="0" w:evenVBand="0" w:oddHBand="1" w:evenHBand="0" w:firstRowFirstColumn="0" w:firstRowLastColumn="0" w:lastRowFirstColumn="0" w:lastRowLastColumn="0"/>
                     <w:rPr>
                       <w:rFonts w:ascii="Verdana" w:eastAsia="Verdana" w:hAnsi="Verdana" w:cs="Verdana"/>
                     </w:rPr>
@@ -8304,7 +8744,7 @@
                     <w:spacing w:line="241" w:lineRule="auto"/>
                     <w:ind w:right="84"/>
                     <w:jc w:val="both"/>
-                    <w:cnfStyle w:val="000000000000" w:firstRow="0" w:lastRow="0" w:firstColumn="0" w:lastColumn="0" w:oddVBand="0" w:evenVBand="0" w:oddHBand="0" w:evenHBand="0" w:firstRowFirstColumn="0" w:firstRowLastColumn="0" w:lastRowFirstColumn="0" w:lastRowLastColumn="0"/>
+                    <w:cnfStyle w:val="000000100000" w:firstRow="0" w:lastRow="0" w:firstColumn="0" w:lastColumn="0" w:oddVBand="0" w:evenVBand="0" w:oddHBand="1" w:evenHBand="0" w:firstRowFirstColumn="0" w:firstRowLastColumn="0" w:lastRowFirstColumn="0" w:lastRowLastColumn="0"/>
                     <w:rPr>
                       <w:rFonts w:ascii="Verdana" w:eastAsia="Verdana" w:hAnsi="Verdana" w:cs="Verdana"/>
                     </w:rPr>
@@ -8341,7 +8781,7 @@
                     <w:spacing w:line="241" w:lineRule="auto"/>
                     <w:ind w:right="84"/>
                     <w:jc w:val="both"/>
-                    <w:cnfStyle w:val="000000000000" w:firstRow="0" w:lastRow="0" w:firstColumn="0" w:lastColumn="0" w:oddVBand="0" w:evenVBand="0" w:oddHBand="0" w:evenHBand="0" w:firstRowFirstColumn="0" w:firstRowLastColumn="0" w:lastRowFirstColumn="0" w:lastRowLastColumn="0"/>
+                    <w:cnfStyle w:val="000000100000" w:firstRow="0" w:lastRow="0" w:firstColumn="0" w:lastColumn="0" w:oddVBand="0" w:evenVBand="0" w:oddHBand="1" w:evenHBand="0" w:firstRowFirstColumn="0" w:firstRowLastColumn="0" w:lastRowFirstColumn="0" w:lastRowLastColumn="0"/>
                     <w:rPr>
                       <w:rFonts w:ascii="Verdana" w:eastAsia="Verdana" w:hAnsi="Verdana" w:cs="Verdana"/>
                     </w:rPr>
@@ -8364,7 +8804,7 @@
                     <w:spacing w:line="241" w:lineRule="auto"/>
                     <w:ind w:right="84"/>
                     <w:jc w:val="both"/>
-                    <w:cnfStyle w:val="000000000000" w:firstRow="0" w:lastRow="0" w:firstColumn="0" w:lastColumn="0" w:oddVBand="0" w:evenVBand="0" w:oddHBand="0" w:evenHBand="0" w:firstRowFirstColumn="0" w:firstRowLastColumn="0" w:lastRowFirstColumn="0" w:lastRowLastColumn="0"/>
+                    <w:cnfStyle w:val="000000100000" w:firstRow="0" w:lastRow="0" w:firstColumn="0" w:lastColumn="0" w:oddVBand="0" w:evenVBand="0" w:oddHBand="1" w:evenHBand="0" w:firstRowFirstColumn="0" w:firstRowLastColumn="0" w:lastRowFirstColumn="0" w:lastRowLastColumn="0"/>
                     <w:rPr>
                       <w:rFonts w:ascii="Verdana" w:eastAsia="Verdana" w:hAnsi="Verdana" w:cs="Verdana"/>
                     </w:rPr>
@@ -8415,7 +8855,7 @@
                     <w:spacing w:line="241" w:lineRule="auto"/>
                     <w:ind w:right="84"/>
                     <w:jc w:val="both"/>
-                    <w:cnfStyle w:val="000000000000" w:firstRow="0" w:lastRow="0" w:firstColumn="0" w:lastColumn="0" w:oddVBand="0" w:evenVBand="0" w:oddHBand="0" w:evenHBand="0" w:firstRowFirstColumn="0" w:firstRowLastColumn="0" w:lastRowFirstColumn="0" w:lastRowLastColumn="0"/>
+                    <w:cnfStyle w:val="000000100000" w:firstRow="0" w:lastRow="0" w:firstColumn="0" w:lastColumn="0" w:oddVBand="0" w:evenVBand="0" w:oddHBand="1" w:evenHBand="0" w:firstRowFirstColumn="0" w:firstRowLastColumn="0" w:lastRowFirstColumn="0" w:lastRowLastColumn="0"/>
                     <w:rPr>
                       <w:rFonts w:ascii="Verdana" w:eastAsia="Verdana" w:hAnsi="Verdana" w:cs="Verdana"/>
                     </w:rPr>
@@ -8438,7 +8878,7 @@
                     <w:spacing w:line="241" w:lineRule="auto"/>
                     <w:ind w:right="84"/>
                     <w:jc w:val="both"/>
-                    <w:cnfStyle w:val="000000000000" w:firstRow="0" w:lastRow="0" w:firstColumn="0" w:lastColumn="0" w:oddVBand="0" w:evenVBand="0" w:oddHBand="0" w:evenHBand="0" w:firstRowFirstColumn="0" w:firstRowLastColumn="0" w:lastRowFirstColumn="0" w:lastRowLastColumn="0"/>
+                    <w:cnfStyle w:val="000000100000" w:firstRow="0" w:lastRow="0" w:firstColumn="0" w:lastColumn="0" w:oddVBand="0" w:evenVBand="0" w:oddHBand="1" w:evenHBand="0" w:firstRowFirstColumn="0" w:firstRowLastColumn="0" w:lastRowFirstColumn="0" w:lastRowLastColumn="0"/>
                     <w:rPr>
                       <w:rFonts w:ascii="Verdana" w:eastAsia="Verdana" w:hAnsi="Verdana" w:cs="Verdana"/>
                     </w:rPr>
@@ -8461,7 +8901,7 @@
                     <w:spacing w:line="241" w:lineRule="auto"/>
                     <w:ind w:right="84"/>
                     <w:jc w:val="both"/>
-                    <w:cnfStyle w:val="000000000000" w:firstRow="0" w:lastRow="0" w:firstColumn="0" w:lastColumn="0" w:oddVBand="0" w:evenVBand="0" w:oddHBand="0" w:evenHBand="0" w:firstRowFirstColumn="0" w:firstRowLastColumn="0" w:lastRowFirstColumn="0" w:lastRowLastColumn="0"/>
+                    <w:cnfStyle w:val="000000100000" w:firstRow="0" w:lastRow="0" w:firstColumn="0" w:lastColumn="0" w:oddVBand="0" w:evenVBand="0" w:oddHBand="1" w:evenHBand="0" w:firstRowFirstColumn="0" w:firstRowLastColumn="0" w:lastRowFirstColumn="0" w:lastRowLastColumn="0"/>
                     <w:rPr>
                       <w:rFonts w:ascii="Verdana" w:eastAsia="Verdana" w:hAnsi="Verdana" w:cs="Verdana"/>
                     </w:rPr>
@@ -8475,35 +8915,16 @@
                 </w:p>
                 <w:p>
                   <w:pPr>
+                    <w:pStyle w:val="PargrafodaLista"/>
                     <w:framePr w:hSpace="141" w:wrap="around" w:hAnchor="margin" w:x="-289" w:y="548"/>
                     <w:spacing w:line="241" w:lineRule="auto"/>
                     <w:ind w:right="84"/>
                     <w:jc w:val="both"/>
-                    <w:cnfStyle w:val="000000000000" w:firstRow="0" w:lastRow="0" w:firstColumn="0" w:lastColumn="0" w:oddVBand="0" w:evenVBand="0" w:oddHBand="0" w:evenHBand="0" w:firstRowFirstColumn="0" w:firstRowLastColumn="0" w:lastRowFirstColumn="0" w:lastRowLastColumn="0"/>
-                    <w:rPr>
-                      <w:rFonts w:ascii="Verdana" w:eastAsia="Verdana" w:hAnsi="Verdana" w:cs="Verdana"/>
-                    </w:rPr>
-                  </w:pPr>
-                  <w:r>
-                    <w:rPr>
-                      <w:rFonts w:ascii="Verdana" w:eastAsia="Verdana" w:hAnsi="Verdana" w:cs="Verdana"/>
-                    </w:rPr>
-                    <w:t xml:space="preserve">Além disso, essa página possui uma representação gráfica das tentativas realizadas, </w:t>
-                  </w:r>
-                  <w:proofErr w:type="spellStart"/>
-                  <w:r>
-                    <w:rPr>
-                      <w:rFonts w:ascii="Verdana" w:eastAsia="Verdana" w:hAnsi="Verdana" w:cs="Verdana"/>
-                    </w:rPr>
-                    <w:t>ex</w:t>
-                  </w:r>
-                  <w:proofErr w:type="spellEnd"/>
-                  <w:r>
-                    <w:rPr>
-                      <w:rFonts w:ascii="Verdana" w:eastAsia="Verdana" w:hAnsi="Verdana" w:cs="Verdana"/>
-                    </w:rPr>
-                    <w:t>:</w:t>
-                  </w:r>
+                    <w:cnfStyle w:val="000000100000" w:firstRow="0" w:lastRow="0" w:firstColumn="0" w:lastColumn="0" w:oddVBand="0" w:evenVBand="0" w:oddHBand="1" w:evenHBand="0" w:firstRowFirstColumn="0" w:firstRowLastColumn="0" w:lastRowFirstColumn="0" w:lastRowLastColumn="0"/>
+                    <w:rPr>
+                      <w:rFonts w:ascii="Verdana" w:eastAsia="Verdana" w:hAnsi="Verdana" w:cs="Verdana"/>
+                    </w:rPr>
+                  </w:pPr>
                 </w:p>
                 <w:p>
                   <w:pPr>
@@ -8511,7 +8932,51 @@
                     <w:spacing w:line="241" w:lineRule="auto"/>
                     <w:ind w:right="84"/>
                     <w:jc w:val="both"/>
-                    <w:cnfStyle w:val="000000000000" w:firstRow="0" w:lastRow="0" w:firstColumn="0" w:lastColumn="0" w:oddVBand="0" w:evenVBand="0" w:oddHBand="0" w:evenHBand="0" w:firstRowFirstColumn="0" w:firstRowLastColumn="0" w:lastRowFirstColumn="0" w:lastRowLastColumn="0"/>
+                    <w:cnfStyle w:val="000000100000" w:firstRow="0" w:lastRow="0" w:firstColumn="0" w:lastColumn="0" w:oddVBand="0" w:evenVBand="0" w:oddHBand="1" w:evenHBand="0" w:firstRowFirstColumn="0" w:firstRowLastColumn="0" w:lastRowFirstColumn="0" w:lastRowLastColumn="0"/>
+                    <w:rPr>
+                      <w:rFonts w:ascii="Verdana" w:eastAsia="Verdana" w:hAnsi="Verdana" w:cs="Verdana"/>
+                    </w:rPr>
+                  </w:pPr>
+                  <w:r>
+                    <w:rPr>
+                      <w:rFonts w:ascii="Verdana" w:eastAsia="Verdana" w:hAnsi="Verdana" w:cs="Verdana"/>
+                    </w:rPr>
+                    <w:t xml:space="preserve">Além disso, essa página possui uma representação gráfica das tentativas realizadas, </w:t>
+                  </w:r>
+                  <w:proofErr w:type="spellStart"/>
+                  <w:r>
+                    <w:rPr>
+                      <w:rFonts w:ascii="Verdana" w:eastAsia="Verdana" w:hAnsi="Verdana" w:cs="Verdana"/>
+                    </w:rPr>
+                    <w:t>ex</w:t>
+                  </w:r>
+                  <w:proofErr w:type="spellEnd"/>
+                  <w:r>
+                    <w:rPr>
+                      <w:rFonts w:ascii="Verdana" w:eastAsia="Verdana" w:hAnsi="Verdana" w:cs="Verdana"/>
+                    </w:rPr>
+                    <w:t>:</w:t>
+                  </w:r>
+                </w:p>
+                <w:p>
+                  <w:pPr>
+                    <w:framePr w:hSpace="141" w:wrap="around" w:hAnchor="margin" w:x="-289" w:y="548"/>
+                    <w:spacing w:line="241" w:lineRule="auto"/>
+                    <w:ind w:right="84"/>
+                    <w:jc w:val="both"/>
+                    <w:cnfStyle w:val="000000100000" w:firstRow="0" w:lastRow="0" w:firstColumn="0" w:lastColumn="0" w:oddVBand="0" w:evenVBand="0" w:oddHBand="1" w:evenHBand="0" w:firstRowFirstColumn="0" w:firstRowLastColumn="0" w:lastRowFirstColumn="0" w:lastRowLastColumn="0"/>
+                    <w:rPr>
+                      <w:rFonts w:ascii="Verdana" w:eastAsia="Verdana" w:hAnsi="Verdana" w:cs="Verdana"/>
+                    </w:rPr>
+                  </w:pPr>
+                </w:p>
+                <w:p>
+                  <w:pPr>
+                    <w:framePr w:hSpace="141" w:wrap="around" w:hAnchor="margin" w:x="-289" w:y="548"/>
+                    <w:spacing w:line="241" w:lineRule="auto"/>
+                    <w:ind w:right="84"/>
+                    <w:jc w:val="both"/>
+                    <w:cnfStyle w:val="000000100000" w:firstRow="0" w:lastRow="0" w:firstColumn="0" w:lastColumn="0" w:oddVBand="0" w:evenVBand="0" w:oddHBand="1" w:evenHBand="0" w:firstRowFirstColumn="0" w:firstRowLastColumn="0" w:lastRowFirstColumn="0" w:lastRowLastColumn="0"/>
                     <w:rPr>
                       <w:rFonts w:ascii="Verdana" w:eastAsia="Verdana" w:hAnsi="Verdana" w:cs="Verdana"/>
                     </w:rPr>
@@ -8557,6 +9022,18 @@
                       </wp:inline>
                     </w:drawing>
                   </w:r>
+                </w:p>
+                <w:p>
+                  <w:pPr>
+                    <w:framePr w:hSpace="141" w:wrap="around" w:hAnchor="margin" w:x="-289" w:y="548"/>
+                    <w:spacing w:line="241" w:lineRule="auto"/>
+                    <w:ind w:right="84"/>
+                    <w:jc w:val="both"/>
+                    <w:cnfStyle w:val="000000100000" w:firstRow="0" w:lastRow="0" w:firstColumn="0" w:lastColumn="0" w:oddVBand="0" w:evenVBand="0" w:oddHBand="1" w:evenHBand="0" w:firstRowFirstColumn="0" w:firstRowLastColumn="0" w:lastRowFirstColumn="0" w:lastRowLastColumn="0"/>
+                    <w:rPr>
+                      <w:rFonts w:ascii="Verdana" w:eastAsia="Verdana" w:hAnsi="Verdana" w:cs="Verdana"/>
+                    </w:rPr>
+                  </w:pPr>
                 </w:p>
               </w:tc>
             </w:tr>
@@ -8916,6 +9393,343 @@
                     </w:rPr>
                     <w:t>.</w:t>
                   </w:r>
+                </w:p>
+                <w:p>
+                  <w:pPr>
+                    <w:framePr w:hSpace="141" w:wrap="around" w:hAnchor="margin" w:x="-289" w:y="548"/>
+                    <w:ind w:right="85"/>
+                    <w:jc w:val="both"/>
+                    <w:cnfStyle w:val="000000100000" w:firstRow="0" w:lastRow="0" w:firstColumn="0" w:lastColumn="0" w:oddVBand="0" w:evenVBand="0" w:oddHBand="1" w:evenHBand="0" w:firstRowFirstColumn="0" w:firstRowLastColumn="0" w:lastRowFirstColumn="0" w:lastRowLastColumn="0"/>
+                    <w:rPr>
+                      <w:rFonts w:ascii="Verdana" w:hAnsi="Verdana"/>
+                    </w:rPr>
+                  </w:pPr>
+                </w:p>
+              </w:tc>
+            </w:tr>
+            <w:tr>
+              <w:trPr>
+                <w:trHeight w:val="1025"/>
+              </w:trPr>
+              <w:tc>
+                <w:tcPr>
+                  <w:cnfStyle w:val="001000000000" w:firstRow="0" w:lastRow="0" w:firstColumn="1" w:lastColumn="0" w:oddVBand="0" w:evenVBand="0" w:oddHBand="0" w:evenHBand="0" w:firstRowFirstColumn="0" w:firstRowLastColumn="0" w:lastRowFirstColumn="0" w:lastRowLastColumn="0"/>
+                  <w:tcW w:w="1449" w:type="dxa"/>
+                  <w:vAlign w:val="center"/>
+                </w:tcPr>
+                <w:p>
+                  <w:pPr>
+                    <w:framePr w:hSpace="141" w:wrap="around" w:hAnchor="margin" w:x="-289" w:y="548"/>
+                    <w:jc w:val="center"/>
+                    <w:rPr>
+                      <w:rFonts w:ascii="Verdana" w:hAnsi="Verdana"/>
+                    </w:rPr>
+                  </w:pPr>
+                  <w:r>
+                    <w:rPr>
+                      <w:rFonts w:ascii="Verdana" w:hAnsi="Verdana"/>
+                    </w:rPr>
+                    <w:t>9.3</w:t>
+                  </w:r>
+                </w:p>
+              </w:tc>
+              <w:tc>
+                <w:tcPr>
+                  <w:tcW w:w="3492" w:type="dxa"/>
+                  <w:vAlign w:val="center"/>
+                </w:tcPr>
+                <w:p>
+                  <w:pPr>
+                    <w:framePr w:hSpace="141" w:wrap="around" w:hAnchor="margin" w:x="-289" w:y="548"/>
+                    <w:jc w:val="center"/>
+                    <w:cnfStyle w:val="000000000000" w:firstRow="0" w:lastRow="0" w:firstColumn="0" w:lastColumn="0" w:oddVBand="0" w:evenVBand="0" w:oddHBand="0" w:evenHBand="0" w:firstRowFirstColumn="0" w:firstRowLastColumn="0" w:lastRowFirstColumn="0" w:lastRowLastColumn="0"/>
+                    <w:rPr>
+                      <w:rFonts w:ascii="Verdana" w:eastAsia="Verdana" w:hAnsi="Verdana" w:cs="Verdana"/>
+                      <w:b/>
+                      <w:bCs/>
+                    </w:rPr>
+                  </w:pPr>
+                  <w:r>
+                    <w:rPr>
+                      <w:rFonts w:ascii="Verdana" w:hAnsi="Verdana"/>
+                      <w:b/>
+                      <w:bCs/>
+                      <w:sz w:val="22"/>
+                      <w:szCs w:val="22"/>
+                    </w:rPr>
+                    <w:t>Visualizar detalhes de alguma tentativa</w:t>
+                  </w:r>
+                </w:p>
+              </w:tc>
+              <w:tc>
+                <w:tcPr>
+                  <w:tcW w:w="3552" w:type="dxa"/>
+                  <w:vAlign w:val="center"/>
+                </w:tcPr>
+                <w:p>
+                  <w:pPr>
+                    <w:framePr w:hSpace="141" w:wrap="around" w:hAnchor="margin" w:x="-289" w:y="548"/>
+                    <w:spacing w:after="1"/>
+                    <w:ind w:right="84"/>
+                    <w:jc w:val="both"/>
+                    <w:cnfStyle w:val="000000000000" w:firstRow="0" w:lastRow="0" w:firstColumn="0" w:lastColumn="0" w:oddVBand="0" w:evenVBand="0" w:oddHBand="0" w:evenHBand="0" w:firstRowFirstColumn="0" w:firstRowLastColumn="0" w:lastRowFirstColumn="0" w:lastRowLastColumn="0"/>
+                    <w:rPr>
+                      <w:rFonts w:ascii="Verdana" w:eastAsia="Verdana" w:hAnsi="Verdana" w:cs="Verdana"/>
+                    </w:rPr>
+                  </w:pPr>
+                  <w:r>
+                    <w:rPr>
+                      <w:rFonts w:ascii="Verdana" w:eastAsia="Verdana" w:hAnsi="Verdana" w:cs="Verdana"/>
+                    </w:rPr>
+                    <w:t>Na página do histórico de tentativas,</w:t>
+                  </w:r>
+                  <w:r>
+                    <w:rPr>
+                      <w:rFonts w:ascii="Verdana" w:eastAsia="Verdana" w:hAnsi="Verdana" w:cs="Verdana"/>
+                    </w:rPr>
+                    <w:t xml:space="preserve"> e das atividades cadastradas</w:t>
+                  </w:r>
+                  <w:r>
+                    <w:rPr>
+                      <w:rFonts w:ascii="Verdana" w:eastAsia="Verdana" w:hAnsi="Verdana" w:cs="Verdana"/>
+                    </w:rPr>
+                    <w:t xml:space="preserve"> é possível ver detalhes da tentativa realizada, ao clicar nesse botão um card abre com as seguintes informações:</w:t>
+                  </w:r>
+                </w:p>
+                <w:p>
+                  <w:pPr>
+                    <w:framePr w:hSpace="141" w:wrap="around" w:hAnchor="margin" w:x="-289" w:y="548"/>
+                    <w:spacing w:after="1"/>
+                    <w:ind w:right="84"/>
+                    <w:jc w:val="both"/>
+                    <w:cnfStyle w:val="000000000000" w:firstRow="0" w:lastRow="0" w:firstColumn="0" w:lastColumn="0" w:oddVBand="0" w:evenVBand="0" w:oddHBand="0" w:evenHBand="0" w:firstRowFirstColumn="0" w:firstRowLastColumn="0" w:lastRowFirstColumn="0" w:lastRowLastColumn="0"/>
+                    <w:rPr>
+                      <w:rFonts w:ascii="Verdana" w:eastAsia="Verdana" w:hAnsi="Verdana" w:cs="Verdana"/>
+                    </w:rPr>
+                  </w:pPr>
+                </w:p>
+                <w:p>
+                  <w:pPr>
+                    <w:pStyle w:val="PargrafodaLista"/>
+                    <w:numPr>
+                      <w:ilvl w:val="0"/>
+                      <w:numId w:val="34"/>
+                    </w:numPr>
+                    <w:spacing w:line="241" w:lineRule="auto"/>
+                    <w:ind w:right="84"/>
+                    <w:jc w:val="both"/>
+                    <w:cnfStyle w:val="000000000000" w:firstRow="0" w:lastRow="0" w:firstColumn="0" w:lastColumn="0" w:oddVBand="0" w:evenVBand="0" w:oddHBand="0" w:evenHBand="0" w:firstRowFirstColumn="0" w:firstRowLastColumn="0" w:lastRowFirstColumn="0" w:lastRowLastColumn="0"/>
+                    <w:rPr>
+                      <w:rFonts w:ascii="Verdana" w:eastAsia="Verdana" w:hAnsi="Verdana" w:cs="Verdana"/>
+                    </w:rPr>
+                  </w:pPr>
+                  <w:r>
+                    <w:rPr>
+                      <w:rFonts w:ascii="Verdana" w:eastAsia="Verdana" w:hAnsi="Verdana" w:cs="Verdana"/>
+                    </w:rPr>
+                    <w:t xml:space="preserve">Área da atividade, </w:t>
+                  </w:r>
+                  <w:proofErr w:type="spellStart"/>
+                  <w:r>
+                    <w:rPr>
+                      <w:rFonts w:ascii="Verdana" w:eastAsia="Verdana" w:hAnsi="Verdana" w:cs="Verdana"/>
+                    </w:rPr>
+                    <w:t>ex</w:t>
+                  </w:r>
+                  <w:proofErr w:type="spellEnd"/>
+                  <w:r>
+                    <w:rPr>
+                      <w:rFonts w:ascii="Verdana" w:eastAsia="Verdana" w:hAnsi="Verdana" w:cs="Verdana"/>
+                    </w:rPr>
+                    <w:t>: Socialização</w:t>
+                  </w:r>
+                </w:p>
+                <w:p>
+                  <w:pPr>
+                    <w:pStyle w:val="PargrafodaLista"/>
+                    <w:numPr>
+                      <w:ilvl w:val="0"/>
+                      <w:numId w:val="33"/>
+                    </w:numPr>
+                    <w:spacing w:line="241" w:lineRule="auto"/>
+                    <w:ind w:right="84"/>
+                    <w:jc w:val="both"/>
+                    <w:cnfStyle w:val="000000000000" w:firstRow="0" w:lastRow="0" w:firstColumn="0" w:lastColumn="0" w:oddVBand="0" w:evenVBand="0" w:oddHBand="0" w:evenHBand="0" w:firstRowFirstColumn="0" w:firstRowLastColumn="0" w:lastRowFirstColumn="0" w:lastRowLastColumn="0"/>
+                    <w:rPr>
+                      <w:rFonts w:ascii="Verdana" w:eastAsia="Verdana" w:hAnsi="Verdana" w:cs="Verdana"/>
+                    </w:rPr>
+                  </w:pPr>
+                  <w:r>
+                    <w:rPr>
+                      <w:rFonts w:ascii="Verdana" w:eastAsia="Verdana" w:hAnsi="Verdana" w:cs="Verdana"/>
+                    </w:rPr>
+                    <w:t>Atividade desenvolvida</w:t>
+                  </w:r>
+                </w:p>
+                <w:p>
+                  <w:pPr>
+                    <w:pStyle w:val="PargrafodaLista"/>
+                    <w:numPr>
+                      <w:ilvl w:val="0"/>
+                      <w:numId w:val="33"/>
+                    </w:numPr>
+                    <w:spacing w:line="241" w:lineRule="auto"/>
+                    <w:ind w:right="84"/>
+                    <w:jc w:val="both"/>
+                    <w:cnfStyle w:val="000000000000" w:firstRow="0" w:lastRow="0" w:firstColumn="0" w:lastColumn="0" w:oddVBand="0" w:evenVBand="0" w:oddHBand="0" w:evenHBand="0" w:firstRowFirstColumn="0" w:firstRowLastColumn="0" w:lastRowFirstColumn="0" w:lastRowLastColumn="0"/>
+                    <w:rPr>
+                      <w:rFonts w:ascii="Verdana" w:eastAsia="Verdana" w:hAnsi="Verdana" w:cs="Verdana"/>
+                    </w:rPr>
+                  </w:pPr>
+                  <w:r>
+                    <w:rPr>
+                      <w:rFonts w:ascii="Verdana" w:eastAsia="Verdana" w:hAnsi="Verdana" w:cs="Verdana"/>
+                    </w:rPr>
+                    <w:t>Resultado (</w:t>
+                  </w:r>
+                  <w:r>
+                    <w:rPr>
+                      <w:rFonts w:ascii="Verdana" w:eastAsia="Verdana" w:hAnsi="Verdana" w:cs="Verdana"/>
+                      <w:b/>
+                      <w:bCs/>
+                    </w:rPr>
+                    <w:t>Êxito</w:t>
+                  </w:r>
+                  <w:r>
+                    <w:rPr>
+                      <w:rFonts w:ascii="Verdana" w:eastAsia="Verdana" w:hAnsi="Verdana" w:cs="Verdana"/>
+                    </w:rPr>
+                    <w:t xml:space="preserve"> ou </w:t>
+                  </w:r>
+                  <w:r>
+                    <w:rPr>
+                      <w:rFonts w:ascii="Verdana" w:eastAsia="Verdana" w:hAnsi="Verdana" w:cs="Verdana"/>
+                      <w:b/>
+                      <w:bCs/>
+                    </w:rPr>
+                    <w:t>Falha</w:t>
+                  </w:r>
+                  <w:r>
+                    <w:rPr>
+                      <w:rFonts w:ascii="Verdana" w:eastAsia="Verdana" w:hAnsi="Verdana" w:cs="Verdana"/>
+                    </w:rPr>
+                    <w:t>)</w:t>
+                  </w:r>
+                </w:p>
+                <w:p>
+                  <w:pPr>
+                    <w:pStyle w:val="PargrafodaLista"/>
+                    <w:numPr>
+                      <w:ilvl w:val="0"/>
+                      <w:numId w:val="33"/>
+                    </w:numPr>
+                    <w:spacing w:line="241" w:lineRule="auto"/>
+                    <w:ind w:right="84"/>
+                    <w:jc w:val="both"/>
+                    <w:cnfStyle w:val="000000000000" w:firstRow="0" w:lastRow="0" w:firstColumn="0" w:lastColumn="0" w:oddVBand="0" w:evenVBand="0" w:oddHBand="0" w:evenHBand="0" w:firstRowFirstColumn="0" w:firstRowLastColumn="0" w:lastRowFirstColumn="0" w:lastRowLastColumn="0"/>
+                    <w:rPr>
+                      <w:rFonts w:ascii="Verdana" w:eastAsia="Verdana" w:hAnsi="Verdana" w:cs="Verdana"/>
+                    </w:rPr>
+                  </w:pPr>
+                  <w:r>
+                    <w:rPr>
+                      <w:rFonts w:ascii="Verdana" w:eastAsia="Verdana" w:hAnsi="Verdana" w:cs="Verdana"/>
+                    </w:rPr>
+                    <w:t>Realização (Auxilio parcial, Auxilio total ou Independente)</w:t>
+                  </w:r>
+                </w:p>
+                <w:p>
+                  <w:pPr>
+                    <w:pStyle w:val="PargrafodaLista"/>
+                    <w:numPr>
+                      <w:ilvl w:val="0"/>
+                      <w:numId w:val="33"/>
+                    </w:numPr>
+                    <w:spacing w:line="241" w:lineRule="auto"/>
+                    <w:ind w:right="84"/>
+                    <w:jc w:val="both"/>
+                    <w:cnfStyle w:val="000000000000" w:firstRow="0" w:lastRow="0" w:firstColumn="0" w:lastColumn="0" w:oddVBand="0" w:evenVBand="0" w:oddHBand="0" w:evenHBand="0" w:firstRowFirstColumn="0" w:firstRowLastColumn="0" w:lastRowFirstColumn="0" w:lastRowLastColumn="0"/>
+                    <w:rPr>
+                      <w:rFonts w:ascii="Verdana" w:eastAsia="Verdana" w:hAnsi="Verdana" w:cs="Verdana"/>
+                    </w:rPr>
+                  </w:pPr>
+                  <w:r>
+                    <w:rPr>
+                      <w:rFonts w:ascii="Verdana" w:eastAsia="Verdana" w:hAnsi="Verdana" w:cs="Verdana"/>
+                    </w:rPr>
+                    <w:t>Observações</w:t>
+                  </w:r>
+                </w:p>
+                <w:p>
+                  <w:pPr>
+                    <w:pStyle w:val="PargrafodaLista"/>
+                    <w:numPr>
+                      <w:ilvl w:val="0"/>
+                      <w:numId w:val="33"/>
+                    </w:numPr>
+                    <w:spacing w:line="241" w:lineRule="auto"/>
+                    <w:ind w:right="84"/>
+                    <w:jc w:val="both"/>
+                    <w:cnfStyle w:val="000000000000" w:firstRow="0" w:lastRow="0" w:firstColumn="0" w:lastColumn="0" w:oddVBand="0" w:evenVBand="0" w:oddHBand="0" w:evenHBand="0" w:firstRowFirstColumn="0" w:firstRowLastColumn="0" w:lastRowFirstColumn="0" w:lastRowLastColumn="0"/>
+                    <w:rPr>
+                      <w:rFonts w:ascii="Verdana" w:eastAsia="Verdana" w:hAnsi="Verdana" w:cs="Verdana"/>
+                    </w:rPr>
+                  </w:pPr>
+                  <w:r>
+                    <w:rPr>
+                      <w:rFonts w:ascii="Verdana" w:eastAsia="Verdana" w:hAnsi="Verdana" w:cs="Verdana"/>
+                    </w:rPr>
+                    <w:t>Data de aplicação</w:t>
+                  </w:r>
+                </w:p>
+                <w:p>
+                  <w:pPr>
+                    <w:pStyle w:val="PargrafodaLista"/>
+                    <w:framePr w:hSpace="141" w:wrap="around" w:hAnchor="margin" w:x="-289" w:y="548"/>
+                    <w:cnfStyle w:val="000000000000" w:firstRow="0" w:lastRow="0" w:firstColumn="0" w:lastColumn="0" w:oddVBand="0" w:evenVBand="0" w:oddHBand="0" w:evenHBand="0" w:firstRowFirstColumn="0" w:firstRowLastColumn="0" w:lastRowFirstColumn="0" w:lastRowLastColumn="0"/>
+                    <w:rPr>
+                      <w:rFonts w:ascii="Verdana" w:eastAsia="Verdana" w:hAnsi="Verdana" w:cs="Verdana"/>
+                    </w:rPr>
+                  </w:pPr>
+                </w:p>
+                <w:p>
+                  <w:pPr>
+                    <w:framePr w:hSpace="141" w:wrap="around" w:hAnchor="margin" w:x="-289" w:y="548"/>
+                    <w:spacing w:after="1"/>
+                    <w:ind w:right="84"/>
+                    <w:jc w:val="both"/>
+                    <w:cnfStyle w:val="000000000000" w:firstRow="0" w:lastRow="0" w:firstColumn="0" w:lastColumn="0" w:oddVBand="0" w:evenVBand="0" w:oddHBand="0" w:evenHBand="0" w:firstRowFirstColumn="0" w:firstRowLastColumn="0" w:lastRowFirstColumn="0" w:lastRowLastColumn="0"/>
+                    <w:rPr>
+                      <w:rFonts w:ascii="Verdana" w:eastAsia="Verdana" w:hAnsi="Verdana" w:cs="Verdana"/>
+                      <w:b/>
+                      <w:bCs/>
+                    </w:rPr>
+                  </w:pPr>
+                  <w:r>
+                    <w:rPr>
+                      <w:rFonts w:ascii="Verdana" w:eastAsia="Verdana" w:hAnsi="Verdana" w:cs="Verdana"/>
+                    </w:rPr>
+                    <w:t xml:space="preserve">É possível que o psicopedagogo não tenha escrito nada nesse campo, caso aconteça, no lugar onde haveria texto, deve ter a frase </w:t>
+                  </w:r>
+                  <w:r>
+                    <w:rPr>
+                      <w:rFonts w:ascii="Verdana" w:eastAsia="Verdana" w:hAnsi="Verdana" w:cs="Verdana"/>
+                      <w:b/>
+                      <w:bCs/>
+                    </w:rPr>
+                    <w:t>“Nenhuma observação”.</w:t>
+                  </w:r>
+                </w:p>
+                <w:p>
+                  <w:pPr>
+                    <w:framePr w:hSpace="141" w:wrap="around" w:hAnchor="margin" w:x="-289" w:y="548"/>
+                    <w:ind w:right="85"/>
+                    <w:jc w:val="both"/>
+                    <w:cnfStyle w:val="000000000000" w:firstRow="0" w:lastRow="0" w:firstColumn="0" w:lastColumn="0" w:oddVBand="0" w:evenVBand="0" w:oddHBand="0" w:evenHBand="0" w:firstRowFirstColumn="0" w:firstRowLastColumn="0" w:lastRowFirstColumn="0" w:lastRowLastColumn="0"/>
+                    <w:rPr>
+                      <w:rFonts w:ascii="Verdana" w:eastAsia="Verdana" w:hAnsi="Verdana" w:cs="Verdana"/>
+                    </w:rPr>
+                  </w:pPr>
                 </w:p>
               </w:tc>
             </w:tr>
@@ -9579,7 +10393,7 @@
         <v:path o:extrusionok="f" gradientshapeok="t" o:connecttype="rect"/>
         <o:lock v:ext="edit" aspectratio="t"/>
       </v:shapetype>
-      <v:shape id="_x0000_i1053" type="#_x0000_t75" style="width:11.15pt;height:11.15pt" o:bullet="t">
+      <v:shape id="_x0000_i1177" type="#_x0000_t75" style="width:11.25pt;height:11.25pt" o:bullet="t">
         <v:imagedata r:id="rId1" o:title="msoFCA2"/>
       </v:shape>
     </w:pict>
@@ -10666,6 +11480,119 @@
     </w:lvl>
   </w:abstractNum>
   <w:abstractNum w:abstractNumId="10" w15:restartNumberingAfterBreak="0">
+    <w:nsid w:val="39104C10"/>
+    <w:multiLevelType w:val="hybridMultilevel"/>
+    <w:tmpl w:val="95F2F79A"/>
+    <w:lvl w:ilvl="0" w:tplc="04160001">
+      <w:start w:val="1"/>
+      <w:numFmt w:val="bullet"/>
+      <w:lvlText w:val=""/>
+      <w:lvlJc w:val="left"/>
+      <w:pPr>
+        <w:ind w:left="720" w:hanging="360"/>
+      </w:pPr>
+      <w:rPr>
+        <w:rFonts w:ascii="Symbol" w:hAnsi="Symbol" w:hint="default"/>
+      </w:rPr>
+    </w:lvl>
+    <w:lvl w:ilvl="1" w:tplc="04160003" w:tentative="1">
+      <w:start w:val="1"/>
+      <w:numFmt w:val="bullet"/>
+      <w:lvlText w:val="o"/>
+      <w:lvlJc w:val="left"/>
+      <w:pPr>
+        <w:ind w:left="1440" w:hanging="360"/>
+      </w:pPr>
+      <w:rPr>
+        <w:rFonts w:ascii="Courier New" w:hAnsi="Courier New" w:cs="Courier New" w:hint="default"/>
+      </w:rPr>
+    </w:lvl>
+    <w:lvl w:ilvl="2" w:tplc="04160005" w:tentative="1">
+      <w:start w:val="1"/>
+      <w:numFmt w:val="bullet"/>
+      <w:lvlText w:val=""/>
+      <w:lvlJc w:val="left"/>
+      <w:pPr>
+        <w:ind w:left="2160" w:hanging="360"/>
+      </w:pPr>
+      <w:rPr>
+        <w:rFonts w:ascii="Wingdings" w:hAnsi="Wingdings" w:hint="default"/>
+      </w:rPr>
+    </w:lvl>
+    <w:lvl w:ilvl="3" w:tplc="04160001" w:tentative="1">
+      <w:start w:val="1"/>
+      <w:numFmt w:val="bullet"/>
+      <w:lvlText w:val=""/>
+      <w:lvlJc w:val="left"/>
+      <w:pPr>
+        <w:ind w:left="2880" w:hanging="360"/>
+      </w:pPr>
+      <w:rPr>
+        <w:rFonts w:ascii="Symbol" w:hAnsi="Symbol" w:hint="default"/>
+      </w:rPr>
+    </w:lvl>
+    <w:lvl w:ilvl="4" w:tplc="04160003" w:tentative="1">
+      <w:start w:val="1"/>
+      <w:numFmt w:val="bullet"/>
+      <w:lvlText w:val="o"/>
+      <w:lvlJc w:val="left"/>
+      <w:pPr>
+        <w:ind w:left="3600" w:hanging="360"/>
+      </w:pPr>
+      <w:rPr>
+        <w:rFonts w:ascii="Courier New" w:hAnsi="Courier New" w:cs="Courier New" w:hint="default"/>
+      </w:rPr>
+    </w:lvl>
+    <w:lvl w:ilvl="5" w:tplc="04160005" w:tentative="1">
+      <w:start w:val="1"/>
+      <w:numFmt w:val="bullet"/>
+      <w:lvlText w:val=""/>
+      <w:lvlJc w:val="left"/>
+      <w:pPr>
+        <w:ind w:left="4320" w:hanging="360"/>
+      </w:pPr>
+      <w:rPr>
+        <w:rFonts w:ascii="Wingdings" w:hAnsi="Wingdings" w:hint="default"/>
+      </w:rPr>
+    </w:lvl>
+    <w:lvl w:ilvl="6" w:tplc="04160001" w:tentative="1">
+      <w:start w:val="1"/>
+      <w:numFmt w:val="bullet"/>
+      <w:lvlText w:val=""/>
+      <w:lvlJc w:val="left"/>
+      <w:pPr>
+        <w:ind w:left="5040" w:hanging="360"/>
+      </w:pPr>
+      <w:rPr>
+        <w:rFonts w:ascii="Symbol" w:hAnsi="Symbol" w:hint="default"/>
+      </w:rPr>
+    </w:lvl>
+    <w:lvl w:ilvl="7" w:tplc="04160003" w:tentative="1">
+      <w:start w:val="1"/>
+      <w:numFmt w:val="bullet"/>
+      <w:lvlText w:val="o"/>
+      <w:lvlJc w:val="left"/>
+      <w:pPr>
+        <w:ind w:left="5760" w:hanging="360"/>
+      </w:pPr>
+      <w:rPr>
+        <w:rFonts w:ascii="Courier New" w:hAnsi="Courier New" w:cs="Courier New" w:hint="default"/>
+      </w:rPr>
+    </w:lvl>
+    <w:lvl w:ilvl="8" w:tplc="04160005" w:tentative="1">
+      <w:start w:val="1"/>
+      <w:numFmt w:val="bullet"/>
+      <w:lvlText w:val=""/>
+      <w:lvlJc w:val="left"/>
+      <w:pPr>
+        <w:ind w:left="6480" w:hanging="360"/>
+      </w:pPr>
+      <w:rPr>
+        <w:rFonts w:ascii="Wingdings" w:hAnsi="Wingdings" w:hint="default"/>
+      </w:rPr>
+    </w:lvl>
+  </w:abstractNum>
+  <w:abstractNum w:abstractNumId="11" w15:restartNumberingAfterBreak="0">
     <w:nsid w:val="3A1630BD"/>
     <w:multiLevelType w:val="hybridMultilevel"/>
     <w:tmpl w:val="DB2A72BE"/>
@@ -10778,7 +11705,7 @@
       </w:rPr>
     </w:lvl>
   </w:abstractNum>
-  <w:abstractNum w:abstractNumId="11" w15:restartNumberingAfterBreak="0">
+  <w:abstractNum w:abstractNumId="12" w15:restartNumberingAfterBreak="0">
     <w:nsid w:val="3D1B75D1"/>
     <w:multiLevelType w:val="multilevel"/>
     <w:tmpl w:val="0416001F"/>
@@ -10864,7 +11791,7 @@
       </w:pPr>
     </w:lvl>
   </w:abstractNum>
-  <w:abstractNum w:abstractNumId="12" w15:restartNumberingAfterBreak="0">
+  <w:abstractNum w:abstractNumId="13" w15:restartNumberingAfterBreak="0">
     <w:nsid w:val="44DA1BA1"/>
     <w:multiLevelType w:val="hybridMultilevel"/>
     <w:tmpl w:val="2DEAC27C"/>
@@ -10950,7 +11877,7 @@
       </w:pPr>
     </w:lvl>
   </w:abstractNum>
-  <w:abstractNum w:abstractNumId="13" w15:restartNumberingAfterBreak="0">
+  <w:abstractNum w:abstractNumId="14" w15:restartNumberingAfterBreak="0">
     <w:nsid w:val="47E55A38"/>
     <w:multiLevelType w:val="hybridMultilevel"/>
     <w:tmpl w:val="B5FC284A"/>
@@ -11063,7 +11990,7 @@
       </w:rPr>
     </w:lvl>
   </w:abstractNum>
-  <w:abstractNum w:abstractNumId="14" w15:restartNumberingAfterBreak="0">
+  <w:abstractNum w:abstractNumId="15" w15:restartNumberingAfterBreak="0">
     <w:nsid w:val="487619CB"/>
     <w:multiLevelType w:val="hybridMultilevel"/>
     <w:tmpl w:val="93827526"/>
@@ -11176,7 +12103,7 @@
       </w:rPr>
     </w:lvl>
   </w:abstractNum>
-  <w:abstractNum w:abstractNumId="15" w15:restartNumberingAfterBreak="0">
+  <w:abstractNum w:abstractNumId="16" w15:restartNumberingAfterBreak="0">
     <w:nsid w:val="4B3F695A"/>
     <w:multiLevelType w:val="hybridMultilevel"/>
     <w:tmpl w:val="E052458C"/>
@@ -11289,7 +12216,7 @@
       </w:rPr>
     </w:lvl>
   </w:abstractNum>
-  <w:abstractNum w:abstractNumId="16" w15:restartNumberingAfterBreak="0">
+  <w:abstractNum w:abstractNumId="17" w15:restartNumberingAfterBreak="0">
     <w:nsid w:val="571C025F"/>
     <w:multiLevelType w:val="hybridMultilevel"/>
     <w:tmpl w:val="3202DA1C"/>
@@ -11402,7 +12329,7 @@
       </w:rPr>
     </w:lvl>
   </w:abstractNum>
-  <w:abstractNum w:abstractNumId="17" w15:restartNumberingAfterBreak="0">
+  <w:abstractNum w:abstractNumId="18" w15:restartNumberingAfterBreak="0">
     <w:nsid w:val="59985819"/>
     <w:multiLevelType w:val="hybridMultilevel"/>
     <w:tmpl w:val="F4F4B9FE"/>
@@ -11515,7 +12442,7 @@
       </w:rPr>
     </w:lvl>
   </w:abstractNum>
-  <w:abstractNum w:abstractNumId="18" w15:restartNumberingAfterBreak="0">
+  <w:abstractNum w:abstractNumId="19" w15:restartNumberingAfterBreak="0">
     <w:nsid w:val="59B2552E"/>
     <w:multiLevelType w:val="hybridMultilevel"/>
     <w:tmpl w:val="13BA2692"/>
@@ -11628,7 +12555,7 @@
       </w:rPr>
     </w:lvl>
   </w:abstractNum>
-  <w:abstractNum w:abstractNumId="19" w15:restartNumberingAfterBreak="0">
+  <w:abstractNum w:abstractNumId="20" w15:restartNumberingAfterBreak="0">
     <w:nsid w:val="60A60FDC"/>
     <w:multiLevelType w:val="hybridMultilevel"/>
     <w:tmpl w:val="5CD6058E"/>
@@ -11741,7 +12668,7 @@
       </w:rPr>
     </w:lvl>
   </w:abstractNum>
-  <w:abstractNum w:abstractNumId="20" w15:restartNumberingAfterBreak="0">
+  <w:abstractNum w:abstractNumId="21" w15:restartNumberingAfterBreak="0">
     <w:nsid w:val="6322575D"/>
     <w:multiLevelType w:val="hybridMultilevel"/>
     <w:tmpl w:val="A85C5026"/>
@@ -11855,7 +12782,7 @@
       </w:rPr>
     </w:lvl>
   </w:abstractNum>
-  <w:abstractNum w:abstractNumId="21" w15:restartNumberingAfterBreak="0">
+  <w:abstractNum w:abstractNumId="22" w15:restartNumberingAfterBreak="0">
     <w:nsid w:val="64A66FEE"/>
     <w:multiLevelType w:val="hybridMultilevel"/>
     <w:tmpl w:val="7E807AC4"/>
@@ -11995,7 +12922,7 @@
       </w:rPr>
     </w:lvl>
   </w:abstractNum>
-  <w:abstractNum w:abstractNumId="22" w15:restartNumberingAfterBreak="0">
+  <w:abstractNum w:abstractNumId="23" w15:restartNumberingAfterBreak="0">
     <w:nsid w:val="64C81A12"/>
     <w:multiLevelType w:val="hybridMultilevel"/>
     <w:tmpl w:val="B94655B8"/>
@@ -12108,7 +13035,7 @@
       </w:rPr>
     </w:lvl>
   </w:abstractNum>
-  <w:abstractNum w:abstractNumId="23" w15:restartNumberingAfterBreak="0">
+  <w:abstractNum w:abstractNumId="24" w15:restartNumberingAfterBreak="0">
     <w:nsid w:val="679E66D2"/>
     <w:multiLevelType w:val="hybridMultilevel"/>
     <w:tmpl w:val="A038EFB2"/>
@@ -12222,7 +13149,7 @@
       </w:rPr>
     </w:lvl>
   </w:abstractNum>
-  <w:abstractNum w:abstractNumId="24" w15:restartNumberingAfterBreak="0">
+  <w:abstractNum w:abstractNumId="25" w15:restartNumberingAfterBreak="0">
     <w:nsid w:val="68B37980"/>
     <w:multiLevelType w:val="hybridMultilevel"/>
     <w:tmpl w:val="20F83A32"/>
@@ -12335,7 +13262,7 @@
       </w:rPr>
     </w:lvl>
   </w:abstractNum>
-  <w:abstractNum w:abstractNumId="25" w15:restartNumberingAfterBreak="0">
+  <w:abstractNum w:abstractNumId="26" w15:restartNumberingAfterBreak="0">
     <w:nsid w:val="6C525A72"/>
     <w:multiLevelType w:val="hybridMultilevel"/>
     <w:tmpl w:val="0EFAD1D6"/>
@@ -12449,7 +13376,7 @@
       </w:rPr>
     </w:lvl>
   </w:abstractNum>
-  <w:abstractNum w:abstractNumId="26" w15:restartNumberingAfterBreak="0">
+  <w:abstractNum w:abstractNumId="27" w15:restartNumberingAfterBreak="0">
     <w:nsid w:val="6FA43258"/>
     <w:multiLevelType w:val="hybridMultilevel"/>
     <w:tmpl w:val="27066268"/>
@@ -12562,7 +13489,7 @@
       </w:rPr>
     </w:lvl>
   </w:abstractNum>
-  <w:abstractNum w:abstractNumId="27" w15:restartNumberingAfterBreak="0">
+  <w:abstractNum w:abstractNumId="28" w15:restartNumberingAfterBreak="0">
     <w:nsid w:val="731A7BA2"/>
     <w:multiLevelType w:val="hybridMultilevel"/>
     <w:tmpl w:val="AC54A5EA"/>
@@ -12648,7 +13575,7 @@
       </w:pPr>
     </w:lvl>
   </w:abstractNum>
-  <w:abstractNum w:abstractNumId="28" w15:restartNumberingAfterBreak="0">
+  <w:abstractNum w:abstractNumId="29" w15:restartNumberingAfterBreak="0">
     <w:nsid w:val="73943DDA"/>
     <w:multiLevelType w:val="hybridMultilevel"/>
     <w:tmpl w:val="06B25BE2"/>
@@ -12762,7 +13689,7 @@
       </w:rPr>
     </w:lvl>
   </w:abstractNum>
-  <w:abstractNum w:abstractNumId="29" w15:restartNumberingAfterBreak="0">
+  <w:abstractNum w:abstractNumId="30" w15:restartNumberingAfterBreak="0">
     <w:nsid w:val="789E22DE"/>
     <w:multiLevelType w:val="hybridMultilevel"/>
     <w:tmpl w:val="89D2E740"/>
@@ -12875,7 +13802,7 @@
       </w:rPr>
     </w:lvl>
   </w:abstractNum>
-  <w:abstractNum w:abstractNumId="30" w15:restartNumberingAfterBreak="0">
+  <w:abstractNum w:abstractNumId="31" w15:restartNumberingAfterBreak="0">
     <w:nsid w:val="7B3F6D51"/>
     <w:multiLevelType w:val="hybridMultilevel"/>
     <w:tmpl w:val="24727B44"/>
@@ -12989,7 +13916,7 @@
       </w:rPr>
     </w:lvl>
   </w:abstractNum>
-  <w:abstractNum w:abstractNumId="31" w15:restartNumberingAfterBreak="0">
+  <w:abstractNum w:abstractNumId="32" w15:restartNumberingAfterBreak="0">
     <w:nsid w:val="7E6E2825"/>
     <w:multiLevelType w:val="hybridMultilevel"/>
     <w:tmpl w:val="90B6FE82"/>
@@ -13103,28 +14030,28 @@
     </w:lvl>
   </w:abstractNum>
   <w:num w:numId="1">
-    <w:abstractNumId w:val="28"/>
+    <w:abstractNumId w:val="29"/>
   </w:num>
   <w:num w:numId="2">
-    <w:abstractNumId w:val="27"/>
+    <w:abstractNumId w:val="28"/>
   </w:num>
   <w:num w:numId="3">
     <w:abstractNumId w:val="1"/>
   </w:num>
   <w:num w:numId="4">
-    <w:abstractNumId w:val="30"/>
+    <w:abstractNumId w:val="31"/>
   </w:num>
   <w:num w:numId="5">
-    <w:abstractNumId w:val="11"/>
+    <w:abstractNumId w:val="12"/>
   </w:num>
   <w:num w:numId="6">
-    <w:abstractNumId w:val="23"/>
+    <w:abstractNumId w:val="24"/>
   </w:num>
   <w:num w:numId="7">
     <w:abstractNumId w:val="3"/>
   </w:num>
   <w:num w:numId="8">
-    <w:abstractNumId w:val="25"/>
+    <w:abstractNumId w:val="26"/>
   </w:num>
   <w:num w:numId="9">
     <w:abstractNumId w:val="1"/>
@@ -13157,79 +14084,82 @@
     </w:lvlOverride>
   </w:num>
   <w:num w:numId="10">
-    <w:abstractNumId w:val="21"/>
+    <w:abstractNumId w:val="22"/>
   </w:num>
   <w:num w:numId="11">
-    <w:abstractNumId w:val="21"/>
+    <w:abstractNumId w:val="22"/>
   </w:num>
   <w:num w:numId="12">
-    <w:abstractNumId w:val="20"/>
+    <w:abstractNumId w:val="21"/>
   </w:num>
   <w:num w:numId="13">
     <w:abstractNumId w:val="4"/>
   </w:num>
   <w:num w:numId="14">
-    <w:abstractNumId w:val="17"/>
+    <w:abstractNumId w:val="18"/>
   </w:num>
   <w:num w:numId="15">
-    <w:abstractNumId w:val="15"/>
+    <w:abstractNumId w:val="16"/>
   </w:num>
   <w:num w:numId="16">
-    <w:abstractNumId w:val="22"/>
+    <w:abstractNumId w:val="23"/>
   </w:num>
   <w:num w:numId="17">
     <w:abstractNumId w:val="7"/>
   </w:num>
   <w:num w:numId="18">
-    <w:abstractNumId w:val="29"/>
+    <w:abstractNumId w:val="30"/>
   </w:num>
   <w:num w:numId="19">
     <w:abstractNumId w:val="8"/>
   </w:num>
   <w:num w:numId="20">
-    <w:abstractNumId w:val="31"/>
+    <w:abstractNumId w:val="32"/>
   </w:num>
   <w:num w:numId="21">
     <w:abstractNumId w:val="0"/>
   </w:num>
   <w:num w:numId="22">
-    <w:abstractNumId w:val="26"/>
+    <w:abstractNumId w:val="27"/>
   </w:num>
   <w:num w:numId="23">
-    <w:abstractNumId w:val="12"/>
+    <w:abstractNumId w:val="13"/>
   </w:num>
   <w:num w:numId="24">
     <w:abstractNumId w:val="2"/>
   </w:num>
   <w:num w:numId="25">
-    <w:abstractNumId w:val="19"/>
+    <w:abstractNumId w:val="20"/>
   </w:num>
   <w:num w:numId="26">
     <w:abstractNumId w:val="9"/>
   </w:num>
   <w:num w:numId="27">
-    <w:abstractNumId w:val="16"/>
+    <w:abstractNumId w:val="17"/>
   </w:num>
   <w:num w:numId="28">
     <w:abstractNumId w:val="5"/>
   </w:num>
   <w:num w:numId="29">
-    <w:abstractNumId w:val="13"/>
+    <w:abstractNumId w:val="14"/>
   </w:num>
   <w:num w:numId="30">
-    <w:abstractNumId w:val="18"/>
+    <w:abstractNumId w:val="19"/>
   </w:num>
   <w:num w:numId="31">
     <w:abstractNumId w:val="6"/>
   </w:num>
   <w:num w:numId="32">
-    <w:abstractNumId w:val="24"/>
+    <w:abstractNumId w:val="25"/>
   </w:num>
   <w:num w:numId="33">
-    <w:abstractNumId w:val="10"/>
+    <w:abstractNumId w:val="11"/>
   </w:num>
   <w:num w:numId="34">
-    <w:abstractNumId w:val="14"/>
+    <w:abstractNumId w:val="15"/>
+  </w:num>
+  <w:num w:numId="35">
+    <w:abstractNumId w:val="10"/>
   </w:num>
 </w:numbering>
 </file>

</xml_diff>